<commit_message>
Release v0.0.1: PyQt5 X-ray lab app, Inno Setup installer, GitHub update/rollback
</commit_message>
<xml_diff>
--- a/Laby.docx
+++ b/Laby.docx
@@ -1,6 +1,6 @@
 
 <file path=word/document.xml><?xml version="1.0" encoding="utf-8"?>
-<w:document xmlns:wpc="http://schemas.microsoft.com/office/word/2010/wordprocessingCanvas" xmlns:mc="http://schemas.openxmlformats.org/markup-compatibility/2006" xmlns:o="urn:schemas-microsoft-com:office:office" xmlns:r="http://schemas.openxmlformats.org/officeDocument/2006/relationships" xmlns:m="http://schemas.openxmlformats.org/officeDocument/2006/math" xmlns:v="urn:schemas-microsoft-com:vml" xmlns:wp14="http://schemas.microsoft.com/office/word/2010/wordprocessingDrawing" xmlns:wp="http://schemas.openxmlformats.org/drawingml/2006/wordprocessingDrawing" xmlns:w10="urn:schemas-microsoft-com:office:word" xmlns:w="http://schemas.openxmlformats.org/wordprocessingml/2006/main" xmlns:w14="http://schemas.microsoft.com/office/word/2010/wordml" xmlns:w15="http://schemas.microsoft.com/office/word/2012/wordml" xmlns:wpg="http://schemas.microsoft.com/office/word/2010/wordprocessingGroup" xmlns:wpi="http://schemas.microsoft.com/office/word/2010/wordprocessingInk" xmlns:wne="http://schemas.microsoft.com/office/word/2006/wordml" xmlns:wps="http://schemas.microsoft.com/office/word/2010/wordprocessingShape" mc:Ignorable="w14 w15 wp14">
+<w:document xmlns:wpc="http://schemas.microsoft.com/office/word/2010/wordprocessingCanvas" xmlns:cx="http://schemas.microsoft.com/office/drawing/2014/chartex" xmlns:cx1="http://schemas.microsoft.com/office/drawing/2015/9/8/chartex" xmlns:cx2="http://schemas.microsoft.com/office/drawing/2015/10/21/chartex" xmlns:cx3="http://schemas.microsoft.com/office/drawing/2016/5/9/chartex" xmlns:cx4="http://schemas.microsoft.com/office/drawing/2016/5/10/chartex" xmlns:cx5="http://schemas.microsoft.com/office/drawing/2016/5/11/chartex" xmlns:cx6="http://schemas.microsoft.com/office/drawing/2016/5/12/chartex" xmlns:cx7="http://schemas.microsoft.com/office/drawing/2016/5/13/chartex" xmlns:cx8="http://schemas.microsoft.com/office/drawing/2016/5/14/chartex" xmlns:mc="http://schemas.openxmlformats.org/markup-compatibility/2006" xmlns:aink="http://schemas.microsoft.com/office/drawing/2016/ink" xmlns:am3d="http://schemas.microsoft.com/office/drawing/2017/model3d" xmlns:o="urn:schemas-microsoft-com:office:office" xmlns:oel="http://schemas.microsoft.com/office/2019/extlst" xmlns:r="http://schemas.openxmlformats.org/officeDocument/2006/relationships" xmlns:m="http://schemas.openxmlformats.org/officeDocument/2006/math" xmlns:v="urn:schemas-microsoft-com:vml" xmlns:wp14="http://schemas.microsoft.com/office/word/2010/wordprocessingDrawing" xmlns:wp="http://schemas.openxmlformats.org/drawingml/2006/wordprocessingDrawing" xmlns:w10="urn:schemas-microsoft-com:office:word" xmlns:w="http://schemas.openxmlformats.org/wordprocessingml/2006/main" xmlns:w14="http://schemas.microsoft.com/office/word/2010/wordml" xmlns:w15="http://schemas.microsoft.com/office/word/2012/wordml" xmlns:w16cex="http://schemas.microsoft.com/office/word/2018/wordml/cex" xmlns:w16cid="http://schemas.microsoft.com/office/word/2016/wordml/cid" xmlns:w16="http://schemas.microsoft.com/office/word/2018/wordml" xmlns:w16sdtdh="http://schemas.microsoft.com/office/word/2020/wordml/sdtdatahash" xmlns:w16se="http://schemas.microsoft.com/office/word/2015/wordml/symex" xmlns:wpg="http://schemas.microsoft.com/office/word/2010/wordprocessingGroup" xmlns:wpi="http://schemas.microsoft.com/office/word/2010/wordprocessingInk" xmlns:wne="http://schemas.microsoft.com/office/word/2006/wordml" xmlns:wps="http://schemas.microsoft.com/office/word/2010/wordprocessingShape" mc:Ignorable="w14 w15 w16se w16cid w16 w16cex w16sdtdh wp14">
   <w:body>
     <w:p>
       <w:pPr>
@@ -22,7 +22,7 @@
           <w:lang w:eastAsia="ru-RU"/>
         </w:rPr>
         <w:drawing>
-          <wp:inline distT="0" distB="0" distL="0" distR="0" wp14:anchorId="0356EF74" wp14:editId="392CD942">
+          <wp:inline distT="0" distB="0" distL="0" distR="0" wp14:anchorId="39A00812" wp14:editId="4B62652B">
             <wp:extent cx="2304288" cy="2161164"/>
             <wp:effectExtent l="0" t="0" r="1270" b="0"/>
             <wp:docPr id="1" name="Рисунок 1"/>
@@ -84,12 +84,14 @@
       <w:r>
         <w:t xml:space="preserve"> </w:t>
       </w:r>
+      <w:proofErr w:type="spellStart"/>
       <w:r>
         <w:rPr>
           <w:lang w:val="en-US"/>
         </w:rPr>
         <w:t>SansMS</w:t>
       </w:r>
+      <w:proofErr w:type="spellEnd"/>
       <w:r>
         <w:t xml:space="preserve"> (ну люблю я его)</w:t>
       </w:r>
@@ -127,7 +129,15 @@
         <w:t xml:space="preserve">Размер 800 на «сколько-то» пикселей </w:t>
       </w:r>
       <w:r>
-        <w:t>(общие габариты, фиксированно)</w:t>
+        <w:t xml:space="preserve">(общие габариты, </w:t>
+      </w:r>
+      <w:proofErr w:type="spellStart"/>
+      <w:r>
+        <w:t>фиксированно</w:t>
+      </w:r>
+      <w:proofErr w:type="spellEnd"/>
+      <w:r>
+        <w:t>)</w:t>
       </w:r>
       <w:r>
         <w:t>.</w:t>
@@ -141,6 +151,7 @@
       <w:r>
         <w:t>«На сколько-</w:t>
       </w:r>
+      <w:proofErr w:type="gramStart"/>
       <w:r>
         <w:t>то</w:t>
       </w:r>
@@ -148,7 +159,11 @@
         <w:t>»</w:t>
       </w:r>
       <w:r>
-        <w:t xml:space="preserve">  - потому, что лаб будет, думаю 8-10 в итоге, толщина кнопки на одну лабу фиксирована (как твои кнопки в плеере), сделай высоту окна, чтобы таких 10 строк помещ</w:t>
+        <w:t xml:space="preserve">  -</w:t>
+      </w:r>
+      <w:proofErr w:type="gramEnd"/>
+      <w:r>
+        <w:t xml:space="preserve"> потому, что лаб будет, думаю 8-10 в итоге, толщина кнопки на одну лабу фиксирована (как твои кнопки в плеере), сделай высоту окна, чтобы таких 10 строк помещ</w:t>
       </w:r>
       <w:r>
         <w:t>а</w:t>
@@ -192,14 +207,24 @@
       <w:r>
         <w:t xml:space="preserve"> </w:t>
       </w:r>
+      <w:proofErr w:type="spellStart"/>
       <w:r>
         <w:rPr>
           <w:lang w:val="en-US"/>
         </w:rPr>
         <w:t>SansMS</w:t>
       </w:r>
-      <w:r>
-        <w:t>, жирным,  14 (если можно и не задается автоматически).</w:t>
+      <w:proofErr w:type="spellEnd"/>
+      <w:r>
+        <w:t xml:space="preserve">, </w:t>
+      </w:r>
+      <w:proofErr w:type="gramStart"/>
+      <w:r>
+        <w:t>жирным,  14</w:t>
+      </w:r>
+      <w:proofErr w:type="gramEnd"/>
+      <w:r>
+        <w:t xml:space="preserve"> (если можно и не задается автоматически).</w:t>
       </w:r>
     </w:p>
     <w:p>
@@ -225,7 +250,7 @@
           <w:lang w:eastAsia="ru-RU"/>
         </w:rPr>
         <w:drawing>
-          <wp:inline distT="0" distB="0" distL="0" distR="0" wp14:anchorId="3B304260" wp14:editId="456F2362">
+          <wp:inline distT="0" distB="0" distL="0" distR="0" wp14:anchorId="18CFF92A" wp14:editId="7D96923A">
             <wp:extent cx="5940425" cy="1712595"/>
             <wp:effectExtent l="0" t="0" r="3175" b="1905"/>
             <wp:docPr id="2" name="Рисунок 2"/>
@@ -273,8 +298,13 @@
         <w:ind w:left="0"/>
       </w:pPr>
       <w:r>
-        <w:t>Если в самом заголовке окна все решает настройка винды</w:t>
-      </w:r>
+        <w:t xml:space="preserve">Если в самом заголовке окна все решает настройка </w:t>
+      </w:r>
+      <w:proofErr w:type="spellStart"/>
+      <w:r>
+        <w:t>винды</w:t>
+      </w:r>
+      <w:proofErr w:type="spellEnd"/>
       <w:r>
         <w:t xml:space="preserve"> и как хочу нельзя (или в разных настройках что-то может раком стоять)</w:t>
       </w:r>
@@ -311,6 +341,7 @@
       <w:r>
         <w:t xml:space="preserve"> </w:t>
       </w:r>
+      <w:proofErr w:type="gramStart"/>
       <w:r>
         <w:rPr>
           <w:lang w:val="en-US"/>
@@ -324,7 +355,11 @@
         <w:t xml:space="preserve"> </w:t>
       </w:r>
       <w:r>
-        <w:t>^^</w:t>
+        <w:t>^</w:t>
+      </w:r>
+      <w:proofErr w:type="gramEnd"/>
+      <w:r>
+        <w:t>^</w:t>
       </w:r>
     </w:p>
     <w:p>
@@ -347,7 +382,7 @@
           <w:lang w:eastAsia="ru-RU"/>
         </w:rPr>
         <w:drawing>
-          <wp:inline distT="0" distB="0" distL="0" distR="0" wp14:anchorId="41BF0DD6" wp14:editId="5E282B8B">
+          <wp:inline distT="0" distB="0" distL="0" distR="0" wp14:anchorId="1474B056" wp14:editId="5B9D910F">
             <wp:extent cx="5940425" cy="1720215"/>
             <wp:effectExtent l="0" t="0" r="3175" b="0"/>
             <wp:docPr id="3" name="Рисунок 3"/>
@@ -417,11 +452,16 @@
         <w:t xml:space="preserve">На </w:t>
       </w:r>
       <w:r>
-        <w:t xml:space="preserve">этом поле </w:t>
+        <w:t xml:space="preserve">этом </w:t>
+      </w:r>
+      <w:proofErr w:type="gramStart"/>
+      <w:r>
+        <w:t xml:space="preserve">поле </w:t>
       </w:r>
       <w:r>
         <w:t xml:space="preserve"> –</w:t>
       </w:r>
+      <w:proofErr w:type="gramEnd"/>
       <w:r>
         <w:t xml:space="preserve"> </w:t>
       </w:r>
@@ -476,12 +516,14 @@
       <w:r>
         <w:t xml:space="preserve"> </w:t>
       </w:r>
+      <w:proofErr w:type="spellStart"/>
       <w:r>
         <w:rPr>
           <w:lang w:val="en-US"/>
         </w:rPr>
         <w:t>SansMS</w:t>
       </w:r>
+      <w:proofErr w:type="spellEnd"/>
       <w:r>
         <w:t xml:space="preserve"> (здесь и в следующих окнах)</w:t>
       </w:r>
@@ -501,7 +543,15 @@
         <w:t>4. По нажатию на к</w:t>
       </w:r>
       <w:r>
-        <w:t>нопку «Лаба номер..» открывается новое окно, 1000х600</w:t>
+        <w:t xml:space="preserve">нопку «Лаба </w:t>
+      </w:r>
+      <w:proofErr w:type="gramStart"/>
+      <w:r>
+        <w:t>номер..</w:t>
+      </w:r>
+      <w:proofErr w:type="gramEnd"/>
+      <w:r>
+        <w:t>» открывается новое окно, 1000х600</w:t>
       </w:r>
     </w:p>
     <w:p>
@@ -515,7 +565,7 @@
           <w:lang w:eastAsia="ru-RU"/>
         </w:rPr>
         <w:drawing>
-          <wp:inline distT="0" distB="0" distL="0" distR="0">
+          <wp:inline distT="0" distB="0" distL="0" distR="0" wp14:anchorId="46D2C0AB" wp14:editId="1E364042">
             <wp:extent cx="5943600" cy="4400550"/>
             <wp:effectExtent l="0" t="0" r="0" b="0"/>
             <wp:docPr id="8" name="Рисунок 8"/>
@@ -576,7 +626,15 @@
         <w:ind w:left="0"/>
       </w:pPr>
       <w:r>
-        <w:t>В верхней строке – «Л/р 1. Оценка концентрации вещества рентгеноабсорбционным методом»</w:t>
+        <w:t xml:space="preserve">В верхней строке – «Л/р 1. Оценка концентрации вещества </w:t>
+      </w:r>
+      <w:proofErr w:type="spellStart"/>
+      <w:r>
+        <w:t>рентгеноабсорбционным</w:t>
+      </w:r>
+      <w:proofErr w:type="spellEnd"/>
+      <w:r>
+        <w:t xml:space="preserve"> методом»</w:t>
       </w:r>
     </w:p>
     <w:p>
@@ -632,7 +690,7 @@
         </w:rPr>
         <w:lastRenderedPageBreak/>
         <w:drawing>
-          <wp:inline distT="0" distB="0" distL="0" distR="0">
+          <wp:inline distT="0" distB="0" distL="0" distR="0" wp14:anchorId="224BD92E" wp14:editId="52D76BD6">
             <wp:extent cx="5943600" cy="4410075"/>
             <wp:effectExtent l="0" t="0" r="0" b="9525"/>
             <wp:docPr id="9" name="Рисунок 9"/>
@@ -692,7 +750,7 @@
           <w:lang w:eastAsia="ru-RU"/>
         </w:rPr>
         <w:drawing>
-          <wp:inline distT="0" distB="0" distL="0" distR="0">
+          <wp:inline distT="0" distB="0" distL="0" distR="0" wp14:anchorId="2D50DE70" wp14:editId="12724588">
             <wp:extent cx="5934075" cy="4381500"/>
             <wp:effectExtent l="0" t="0" r="9525" b="0"/>
             <wp:docPr id="10" name="Рисунок 10"/>
@@ -790,11 +848,24 @@
         <w:t xml:space="preserve"> должно быть написано</w:t>
       </w:r>
       <w:r>
-        <w:t xml:space="preserve"> написано «укажите курсором мыши сторону квадрата…», если выбран «Цилиндрический» - то</w:t>
-      </w:r>
-      <w:r>
         <w:t xml:space="preserve"> </w:t>
       </w:r>
+      <w:proofErr w:type="spellStart"/>
+      <w:r>
+        <w:t>написано</w:t>
+      </w:r>
+      <w:proofErr w:type="spellEnd"/>
+      <w:r>
+        <w:t xml:space="preserve"> «укажите курсором мыши сторону квадрата…», если выбран «Цилиндрический» - </w:t>
+      </w:r>
+      <w:proofErr w:type="gramStart"/>
+      <w:r>
+        <w:t>то</w:t>
+      </w:r>
+      <w:proofErr w:type="gramEnd"/>
+      <w:r>
+        <w:t xml:space="preserve"> </w:t>
+      </w:r>
       <w:r>
         <w:t>как на примере – «диаметр»</w:t>
       </w:r>
@@ -810,17 +881,30 @@
         <w:pStyle w:val="a3"/>
         <w:ind w:left="0"/>
       </w:pPr>
+      <w:proofErr w:type="gramStart"/>
       <w:r>
         <w:t xml:space="preserve">Соответственно </w:t>
       </w:r>
       <w:r>
-        <w:t xml:space="preserve"> в следующем поле тоже меняются слова </w:t>
+        <w:t xml:space="preserve"> в</w:t>
+      </w:r>
+      <w:proofErr w:type="gramEnd"/>
+      <w:r>
+        <w:t xml:space="preserve"> следующем поле тоже меняются слова </w:t>
       </w:r>
       <w:r>
         <w:t xml:space="preserve"> - или </w:t>
       </w:r>
       <w:r>
-        <w:t>«Сторона» или «Димаетр» в зависимости от кнопки.</w:t>
+        <w:t>«Сторона» или «</w:t>
+      </w:r>
+      <w:proofErr w:type="spellStart"/>
+      <w:r>
+        <w:t>Димаетр</w:t>
+      </w:r>
+      <w:proofErr w:type="spellEnd"/>
+      <w:r>
+        <w:t>» в зависимости от кнопки.</w:t>
       </w:r>
     </w:p>
     <w:p>
@@ -877,7 +961,15 @@
         <w:ind w:left="0"/>
       </w:pPr>
       <w:r>
-        <w:t>Если кто то вздумает делать это несколько раз – то просто сохраняется (на экране и в памяти компа) последняя нарисованная линия</w:t>
+        <w:t xml:space="preserve">Если </w:t>
+      </w:r>
+      <w:proofErr w:type="gramStart"/>
+      <w:r>
+        <w:t>кто то</w:t>
+      </w:r>
+      <w:proofErr w:type="gramEnd"/>
+      <w:r>
+        <w:t xml:space="preserve"> вздумает делать это несколько раз – то просто сохраняется (на экране и в памяти компа) последняя нарисованная линия</w:t>
       </w:r>
     </w:p>
     <w:p>
@@ -901,8 +993,11 @@
         <w:ind w:left="0"/>
       </w:pPr>
       <w:r>
+        <w:rPr>
+          <w:noProof/>
+        </w:rPr>
         <w:drawing>
-          <wp:inline distT="0" distB="0" distL="0" distR="0" wp14:anchorId="42DC8771" wp14:editId="339519BA">
+          <wp:inline distT="0" distB="0" distL="0" distR="0" wp14:anchorId="44E239E3" wp14:editId="35D39E3F">
             <wp:extent cx="5940425" cy="4379595"/>
             <wp:effectExtent l="0" t="0" r="3175" b="1905"/>
             <wp:docPr id="12" name="Рисунок 12"/>
@@ -956,11 +1051,16 @@
         <w:t>поле «Диаметр»</w:t>
       </w:r>
       <w:r>
-        <w:t xml:space="preserve"> можно ввести целые цифры от 1 до 99 мм.</w:t>
+        <w:t xml:space="preserve"> можно ввести целые цифры от 1 до 99 </w:t>
+      </w:r>
+      <w:proofErr w:type="gramStart"/>
+      <w:r>
+        <w:t>мм.</w:t>
       </w:r>
       <w:r>
         <w:t>.</w:t>
       </w:r>
+      <w:proofErr w:type="gramEnd"/>
     </w:p>
     <w:p>
       <w:pPr>
@@ -982,9 +1082,12 @@
         <w:ind w:left="0"/>
       </w:pPr>
       <w:r>
+        <w:rPr>
+          <w:noProof/>
+        </w:rPr>
         <w:lastRenderedPageBreak/>
         <w:drawing>
-          <wp:inline distT="0" distB="0" distL="0" distR="0" wp14:anchorId="2AE12434" wp14:editId="2A3717C5">
+          <wp:inline distT="0" distB="0" distL="0" distR="0" wp14:anchorId="126A9621" wp14:editId="1E0E2F28">
             <wp:extent cx="5940425" cy="4420870"/>
             <wp:effectExtent l="0" t="0" r="3175" b="0"/>
             <wp:docPr id="13" name="Рисунок 13"/>
@@ -1091,9 +1194,12 @@
         <w:ind w:left="0"/>
       </w:pPr>
       <w:r>
+        <w:rPr>
+          <w:noProof/>
+        </w:rPr>
         <w:lastRenderedPageBreak/>
         <w:drawing>
-          <wp:inline distT="0" distB="0" distL="0" distR="0" wp14:anchorId="79DE1BF3" wp14:editId="23BF7527">
+          <wp:inline distT="0" distB="0" distL="0" distR="0" wp14:anchorId="2133C9BB" wp14:editId="5ACEC740">
             <wp:extent cx="5940425" cy="4398645"/>
             <wp:effectExtent l="0" t="0" r="3175" b="1905"/>
             <wp:docPr id="14" name="Рисунок 14"/>
@@ -1409,13 +1515,7 @@
         <w:t>е</w:t>
       </w:r>
       <w:r>
-        <w:t>сли включения «</w:t>
-      </w:r>
-      <w:r>
-        <w:t>кубические</w:t>
-      </w:r>
-      <w:r>
-        <w:t>» - то объем частиц равен</w:t>
+        <w:t>сли включения «кубические» - то объем частиц равен</w:t>
       </w:r>
     </w:p>
     <w:p>
@@ -1586,8 +1686,13 @@
         <w:pStyle w:val="a3"/>
         <w:ind w:left="0"/>
       </w:pPr>
-      <w:r>
-        <w:t xml:space="preserve">В ) Подсчитывает объем породы: если контейнер квадратный – то объем породы равен квадрату стороны на </w:t>
+      <w:proofErr w:type="gramStart"/>
+      <w:r>
+        <w:t>В )</w:t>
+      </w:r>
+      <w:proofErr w:type="gramEnd"/>
+      <w:r>
+        <w:t xml:space="preserve"> Подсчитывает объем породы: если контейнер квадратный – то объем породы равен квадрату стороны на </w:t>
       </w:r>
       <w:r>
         <w:t xml:space="preserve"> толщину слоя </w:t>
@@ -1616,8 +1721,6 @@
         </w:rPr>
         <w:t>D</w:t>
       </w:r>
-      <w:bookmarkStart w:id="0" w:name="_GoBack"/>
-      <w:bookmarkEnd w:id="0"/>
       <w:r>
         <w:rPr>
           <w:vertAlign w:val="superscript"/>
@@ -1673,8 +1776,2260 @@
         <w:t xml:space="preserve">ПДФ </w:t>
       </w:r>
       <w:r>
-        <w:t>методы и протокола (пока не знаю как – их можно вшить в прогу?)</w:t>
-      </w:r>
+        <w:t xml:space="preserve">методы и протокола (пока не знаю как – их можно вшить в </w:t>
+      </w:r>
+      <w:proofErr w:type="spellStart"/>
+      <w:r>
+        <w:t>прогу</w:t>
+      </w:r>
+      <w:proofErr w:type="spellEnd"/>
+      <w:r>
+        <w:t>?)</w:t>
+      </w:r>
+      <w:r>
+        <w:br w:type="page"/>
+      </w:r>
+    </w:p>
+    <w:tbl>
+      <w:tblPr>
+        <w:tblW w:w="10773" w:type="dxa"/>
+        <w:tblInd w:w="-1139" w:type="dxa"/>
+        <w:tblLook w:val="04A0" w:firstRow="1" w:lastRow="0" w:firstColumn="1" w:lastColumn="0" w:noHBand="0" w:noVBand="1"/>
+      </w:tblPr>
+      <w:tblGrid>
+        <w:gridCol w:w="2689"/>
+        <w:gridCol w:w="4252"/>
+        <w:gridCol w:w="3832"/>
+      </w:tblGrid>
+      <w:tr>
+        <w:trPr>
+          <w:trHeight w:val="300"/>
+        </w:trPr>
+        <w:tc>
+          <w:tcPr>
+            <w:tcW w:w="2689" w:type="dxa"/>
+            <w:tcBorders>
+              <w:top w:val="single" w:sz="4" w:space="0" w:color="3E80A3"/>
+              <w:left w:val="single" w:sz="4" w:space="0" w:color="3E80A3"/>
+              <w:bottom w:val="single" w:sz="4" w:space="0" w:color="3E80A3"/>
+              <w:right w:val="single" w:sz="4" w:space="0" w:color="3E80A3"/>
+            </w:tcBorders>
+            <w:shd w:val="clear" w:color="0A1A2E" w:fill="FFFFFF"/>
+            <w:hideMark/>
+          </w:tcPr>
+          <w:p>
+            <w:pPr>
+              <w:spacing w:after="0" w:line="240" w:lineRule="auto"/>
+              <w:rPr>
+                <w:rFonts w:ascii="Calibri" w:eastAsia="Times New Roman" w:hAnsi="Calibri" w:cs="Calibri"/>
+                <w:color w:val="000000"/>
+                <w:lang w:eastAsia="ru-RU"/>
+              </w:rPr>
+            </w:pPr>
+            <w:r>
+              <w:rPr>
+                <w:rFonts w:ascii="Calibri" w:eastAsia="Times New Roman" w:hAnsi="Calibri" w:cs="Calibri"/>
+                <w:color w:val="000000"/>
+                <w:lang w:eastAsia="ru-RU"/>
+              </w:rPr>
+              <w:lastRenderedPageBreak/>
+              <w:t>Главное окно</w:t>
+            </w:r>
+          </w:p>
+        </w:tc>
+        <w:tc>
+          <w:tcPr>
+            <w:tcW w:w="4252" w:type="dxa"/>
+            <w:tcBorders>
+              <w:top w:val="single" w:sz="4" w:space="0" w:color="3E80A3"/>
+              <w:left w:val="nil"/>
+              <w:bottom w:val="single" w:sz="4" w:space="0" w:color="3E80A3"/>
+              <w:right w:val="single" w:sz="4" w:space="0" w:color="3E80A3"/>
+            </w:tcBorders>
+            <w:shd w:val="clear" w:color="0A1A2E" w:fill="FFFFFF"/>
+            <w:hideMark/>
+          </w:tcPr>
+          <w:p>
+            <w:pPr>
+              <w:spacing w:after="0" w:line="240" w:lineRule="auto"/>
+              <w:rPr>
+                <w:rFonts w:ascii="Calibri" w:eastAsia="Times New Roman" w:hAnsi="Calibri" w:cs="Calibri"/>
+                <w:color w:val="000000"/>
+                <w:lang w:eastAsia="ru-RU"/>
+              </w:rPr>
+            </w:pPr>
+            <w:r>
+              <w:rPr>
+                <w:rFonts w:ascii="Calibri" w:eastAsia="Times New Roman" w:hAnsi="Calibri" w:cs="Calibri"/>
+                <w:color w:val="000000"/>
+                <w:lang w:eastAsia="ru-RU"/>
+              </w:rPr>
+              <w:t>#0f141b (BG_DARK)</w:t>
+            </w:r>
+          </w:p>
+        </w:tc>
+        <w:tc>
+          <w:tcPr>
+            <w:tcW w:w="3832" w:type="dxa"/>
+            <w:tcBorders>
+              <w:top w:val="single" w:sz="4" w:space="0" w:color="3E80A3"/>
+              <w:left w:val="nil"/>
+              <w:bottom w:val="single" w:sz="4" w:space="0" w:color="3E80A3"/>
+              <w:right w:val="single" w:sz="4" w:space="0" w:color="3E80A3"/>
+            </w:tcBorders>
+            <w:shd w:val="clear" w:color="0A1A2E" w:fill="FFFFFF"/>
+            <w:hideMark/>
+          </w:tcPr>
+          <w:p>
+            <w:pPr>
+              <w:spacing w:after="0" w:line="240" w:lineRule="auto"/>
+              <w:rPr>
+                <w:rFonts w:ascii="Calibri" w:eastAsia="Times New Roman" w:hAnsi="Calibri" w:cs="Calibri"/>
+                <w:color w:val="000000"/>
+                <w:lang w:eastAsia="ru-RU"/>
+              </w:rPr>
+            </w:pPr>
+            <w:r>
+              <w:rPr>
+                <w:rFonts w:ascii="Calibri" w:eastAsia="Times New Roman" w:hAnsi="Calibri" w:cs="Calibri"/>
+                <w:color w:val="000000"/>
+                <w:lang w:eastAsia="ru-RU"/>
+              </w:rPr>
+              <w:t>Фон всего приложения</w:t>
+            </w:r>
+          </w:p>
+        </w:tc>
+      </w:tr>
+      <w:tr>
+        <w:trPr>
+          <w:trHeight w:val="600"/>
+        </w:trPr>
+        <w:tc>
+          <w:tcPr>
+            <w:tcW w:w="2689" w:type="dxa"/>
+            <w:tcBorders>
+              <w:top w:val="nil"/>
+              <w:left w:val="single" w:sz="4" w:space="0" w:color="3E80A3"/>
+              <w:bottom w:val="single" w:sz="4" w:space="0" w:color="3E80A3"/>
+              <w:right w:val="single" w:sz="4" w:space="0" w:color="3E80A3"/>
+            </w:tcBorders>
+            <w:shd w:val="clear" w:color="12233A" w:fill="FFFFFF"/>
+            <w:hideMark/>
+          </w:tcPr>
+          <w:p>
+            <w:pPr>
+              <w:spacing w:after="0" w:line="240" w:lineRule="auto"/>
+              <w:rPr>
+                <w:rFonts w:ascii="Calibri" w:eastAsia="Times New Roman" w:hAnsi="Calibri" w:cs="Calibri"/>
+                <w:color w:val="000000"/>
+                <w:lang w:eastAsia="ru-RU"/>
+              </w:rPr>
+            </w:pPr>
+            <w:proofErr w:type="spellStart"/>
+            <w:r>
+              <w:rPr>
+                <w:rFonts w:ascii="Calibri" w:eastAsia="Times New Roman" w:hAnsi="Calibri" w:cs="Calibri"/>
+                <w:color w:val="000000"/>
+                <w:lang w:eastAsia="ru-RU"/>
+              </w:rPr>
+              <w:t>Сайдбар</w:t>
+            </w:r>
+            <w:proofErr w:type="spellEnd"/>
+            <w:r>
+              <w:rPr>
+                <w:rFonts w:ascii="Calibri" w:eastAsia="Times New Roman" w:hAnsi="Calibri" w:cs="Calibri"/>
+                <w:color w:val="000000"/>
+                <w:lang w:eastAsia="ru-RU"/>
+              </w:rPr>
+              <w:t xml:space="preserve"> (плейлисты)</w:t>
+            </w:r>
+          </w:p>
+        </w:tc>
+        <w:tc>
+          <w:tcPr>
+            <w:tcW w:w="4252" w:type="dxa"/>
+            <w:tcBorders>
+              <w:top w:val="nil"/>
+              <w:left w:val="nil"/>
+              <w:bottom w:val="single" w:sz="4" w:space="0" w:color="3E80A3"/>
+              <w:right w:val="single" w:sz="4" w:space="0" w:color="3E80A3"/>
+            </w:tcBorders>
+            <w:shd w:val="clear" w:color="12233A" w:fill="FFFFFF"/>
+            <w:hideMark/>
+          </w:tcPr>
+          <w:p>
+            <w:pPr>
+              <w:spacing w:after="0" w:line="240" w:lineRule="auto"/>
+              <w:rPr>
+                <w:rFonts w:ascii="Calibri" w:eastAsia="Times New Roman" w:hAnsi="Calibri" w:cs="Calibri"/>
+                <w:color w:val="000000"/>
+                <w:lang w:eastAsia="ru-RU"/>
+              </w:rPr>
+            </w:pPr>
+            <w:r>
+              <w:rPr>
+                <w:rFonts w:ascii="Calibri" w:eastAsia="Times New Roman" w:hAnsi="Calibri" w:cs="Calibri"/>
+                <w:color w:val="000000"/>
+                <w:lang w:eastAsia="ru-RU"/>
+              </w:rPr>
+              <w:t>#0a111c (BG_SIDEBAR)</w:t>
+            </w:r>
+          </w:p>
+        </w:tc>
+        <w:tc>
+          <w:tcPr>
+            <w:tcW w:w="3832" w:type="dxa"/>
+            <w:tcBorders>
+              <w:top w:val="nil"/>
+              <w:left w:val="nil"/>
+              <w:bottom w:val="single" w:sz="4" w:space="0" w:color="3E80A3"/>
+              <w:right w:val="single" w:sz="4" w:space="0" w:color="3E80A3"/>
+            </w:tcBorders>
+            <w:shd w:val="clear" w:color="12233A" w:fill="FFFFFF"/>
+            <w:hideMark/>
+          </w:tcPr>
+          <w:p>
+            <w:pPr>
+              <w:spacing w:after="0" w:line="240" w:lineRule="auto"/>
+              <w:rPr>
+                <w:rFonts w:ascii="Calibri" w:eastAsia="Times New Roman" w:hAnsi="Calibri" w:cs="Calibri"/>
+                <w:color w:val="000000"/>
+                <w:lang w:eastAsia="ru-RU"/>
+              </w:rPr>
+            </w:pPr>
+            <w:r>
+              <w:rPr>
+                <w:rFonts w:ascii="Calibri" w:eastAsia="Times New Roman" w:hAnsi="Calibri" w:cs="Calibri"/>
+                <w:color w:val="000000"/>
+                <w:lang w:eastAsia="ru-RU"/>
+              </w:rPr>
+              <w:t>Левая панель со списком плейлистов</w:t>
+            </w:r>
+          </w:p>
+        </w:tc>
+      </w:tr>
+      <w:tr>
+        <w:trPr>
+          <w:trHeight w:val="600"/>
+        </w:trPr>
+        <w:tc>
+          <w:tcPr>
+            <w:tcW w:w="2689" w:type="dxa"/>
+            <w:tcBorders>
+              <w:top w:val="nil"/>
+              <w:left w:val="single" w:sz="4" w:space="0" w:color="3E80A3"/>
+              <w:bottom w:val="single" w:sz="4" w:space="0" w:color="3E80A3"/>
+              <w:right w:val="single" w:sz="4" w:space="0" w:color="3E80A3"/>
+            </w:tcBorders>
+            <w:shd w:val="clear" w:color="0A1A2E" w:fill="FFFFFF"/>
+            <w:hideMark/>
+          </w:tcPr>
+          <w:p>
+            <w:pPr>
+              <w:spacing w:after="0" w:line="240" w:lineRule="auto"/>
+              <w:rPr>
+                <w:rFonts w:ascii="Calibri" w:eastAsia="Times New Roman" w:hAnsi="Calibri" w:cs="Calibri"/>
+                <w:color w:val="000000"/>
+                <w:lang w:eastAsia="ru-RU"/>
+              </w:rPr>
+            </w:pPr>
+            <w:r>
+              <w:rPr>
+                <w:rFonts w:ascii="Calibri" w:eastAsia="Times New Roman" w:hAnsi="Calibri" w:cs="Calibri"/>
+                <w:color w:val="000000"/>
+                <w:lang w:eastAsia="ru-RU"/>
+              </w:rPr>
+              <w:t>Топ-бар (название + кнопки)</w:t>
+            </w:r>
+          </w:p>
+        </w:tc>
+        <w:tc>
+          <w:tcPr>
+            <w:tcW w:w="4252" w:type="dxa"/>
+            <w:tcBorders>
+              <w:top w:val="nil"/>
+              <w:left w:val="nil"/>
+              <w:bottom w:val="single" w:sz="4" w:space="0" w:color="3E80A3"/>
+              <w:right w:val="single" w:sz="4" w:space="0" w:color="3E80A3"/>
+            </w:tcBorders>
+            <w:shd w:val="clear" w:color="0A1A2E" w:fill="FFFFFF"/>
+            <w:hideMark/>
+          </w:tcPr>
+          <w:p>
+            <w:pPr>
+              <w:spacing w:after="0" w:line="240" w:lineRule="auto"/>
+              <w:rPr>
+                <w:rFonts w:ascii="Calibri" w:eastAsia="Times New Roman" w:hAnsi="Calibri" w:cs="Calibri"/>
+                <w:color w:val="000000"/>
+                <w:lang w:eastAsia="ru-RU"/>
+              </w:rPr>
+            </w:pPr>
+            <w:r>
+              <w:rPr>
+                <w:rFonts w:ascii="Calibri" w:eastAsia="Times New Roman" w:hAnsi="Calibri" w:cs="Calibri"/>
+                <w:color w:val="000000"/>
+                <w:lang w:eastAsia="ru-RU"/>
+              </w:rPr>
+              <w:t>#0f141b (BG_DARK)</w:t>
+            </w:r>
+          </w:p>
+        </w:tc>
+        <w:tc>
+          <w:tcPr>
+            <w:tcW w:w="3832" w:type="dxa"/>
+            <w:tcBorders>
+              <w:top w:val="nil"/>
+              <w:left w:val="nil"/>
+              <w:bottom w:val="single" w:sz="4" w:space="0" w:color="3E80A3"/>
+              <w:right w:val="single" w:sz="4" w:space="0" w:color="3E80A3"/>
+            </w:tcBorders>
+            <w:shd w:val="clear" w:color="0A1A2E" w:fill="FFFFFF"/>
+            <w:hideMark/>
+          </w:tcPr>
+          <w:p>
+            <w:pPr>
+              <w:spacing w:after="0" w:line="240" w:lineRule="auto"/>
+              <w:rPr>
+                <w:rFonts w:ascii="Calibri" w:eastAsia="Times New Roman" w:hAnsi="Calibri" w:cs="Calibri"/>
+                <w:color w:val="000000"/>
+                <w:lang w:eastAsia="ru-RU"/>
+              </w:rPr>
+            </w:pPr>
+            <w:r>
+              <w:rPr>
+                <w:rFonts w:ascii="Calibri" w:eastAsia="Times New Roman" w:hAnsi="Calibri" w:cs="Calibri"/>
+                <w:color w:val="000000"/>
+                <w:lang w:eastAsia="ru-RU"/>
+              </w:rPr>
+              <w:t>Верхняя панель с названием плейлиста и кнопками действий</w:t>
+            </w:r>
+          </w:p>
+        </w:tc>
+      </w:tr>
+      <w:tr>
+        <w:trPr>
+          <w:trHeight w:val="300"/>
+        </w:trPr>
+        <w:tc>
+          <w:tcPr>
+            <w:tcW w:w="2689" w:type="dxa"/>
+            <w:tcBorders>
+              <w:top w:val="nil"/>
+              <w:left w:val="single" w:sz="4" w:space="0" w:color="3E80A3"/>
+              <w:bottom w:val="single" w:sz="4" w:space="0" w:color="3E80A3"/>
+              <w:right w:val="single" w:sz="4" w:space="0" w:color="3E80A3"/>
+            </w:tcBorders>
+            <w:shd w:val="clear" w:color="12233A" w:fill="FFFFFF"/>
+            <w:hideMark/>
+          </w:tcPr>
+          <w:p>
+            <w:pPr>
+              <w:spacing w:after="0" w:line="240" w:lineRule="auto"/>
+              <w:rPr>
+                <w:rFonts w:ascii="Calibri" w:eastAsia="Times New Roman" w:hAnsi="Calibri" w:cs="Calibri"/>
+                <w:color w:val="000000"/>
+                <w:lang w:eastAsia="ru-RU"/>
+              </w:rPr>
+            </w:pPr>
+            <w:r>
+              <w:rPr>
+                <w:rFonts w:ascii="Calibri" w:eastAsia="Times New Roman" w:hAnsi="Calibri" w:cs="Calibri"/>
+                <w:color w:val="000000"/>
+                <w:lang w:eastAsia="ru-RU"/>
+              </w:rPr>
+              <w:t>Область треков</w:t>
+            </w:r>
+          </w:p>
+        </w:tc>
+        <w:tc>
+          <w:tcPr>
+            <w:tcW w:w="4252" w:type="dxa"/>
+            <w:tcBorders>
+              <w:top w:val="nil"/>
+              <w:left w:val="nil"/>
+              <w:bottom w:val="single" w:sz="4" w:space="0" w:color="3E80A3"/>
+              <w:right w:val="single" w:sz="4" w:space="0" w:color="3E80A3"/>
+            </w:tcBorders>
+            <w:shd w:val="clear" w:color="12233A" w:fill="FFFFFF"/>
+            <w:hideMark/>
+          </w:tcPr>
+          <w:p>
+            <w:pPr>
+              <w:spacing w:after="0" w:line="240" w:lineRule="auto"/>
+              <w:rPr>
+                <w:rFonts w:ascii="Calibri" w:eastAsia="Times New Roman" w:hAnsi="Calibri" w:cs="Calibri"/>
+                <w:color w:val="000000"/>
+                <w:lang w:eastAsia="ru-RU"/>
+              </w:rPr>
+            </w:pPr>
+            <w:r>
+              <w:rPr>
+                <w:rFonts w:ascii="Calibri" w:eastAsia="Times New Roman" w:hAnsi="Calibri" w:cs="Calibri"/>
+                <w:color w:val="000000"/>
+                <w:lang w:eastAsia="ru-RU"/>
+              </w:rPr>
+              <w:t>#0a1a2e (BG_PANEL)</w:t>
+            </w:r>
+          </w:p>
+        </w:tc>
+        <w:tc>
+          <w:tcPr>
+            <w:tcW w:w="3832" w:type="dxa"/>
+            <w:tcBorders>
+              <w:top w:val="nil"/>
+              <w:left w:val="nil"/>
+              <w:bottom w:val="single" w:sz="4" w:space="0" w:color="3E80A3"/>
+              <w:right w:val="single" w:sz="4" w:space="0" w:color="3E80A3"/>
+            </w:tcBorders>
+            <w:shd w:val="clear" w:color="12233A" w:fill="FFFFFF"/>
+            <w:hideMark/>
+          </w:tcPr>
+          <w:p>
+            <w:pPr>
+              <w:spacing w:after="0" w:line="240" w:lineRule="auto"/>
+              <w:rPr>
+                <w:rFonts w:ascii="Calibri" w:eastAsia="Times New Roman" w:hAnsi="Calibri" w:cs="Calibri"/>
+                <w:color w:val="000000"/>
+                <w:lang w:eastAsia="ru-RU"/>
+              </w:rPr>
+            </w:pPr>
+            <w:r>
+              <w:rPr>
+                <w:rFonts w:ascii="Calibri" w:eastAsia="Times New Roman" w:hAnsi="Calibri" w:cs="Calibri"/>
+                <w:color w:val="000000"/>
+                <w:lang w:eastAsia="ru-RU"/>
+              </w:rPr>
+              <w:t>Контейнер списка треков</w:t>
+            </w:r>
+          </w:p>
+        </w:tc>
+      </w:tr>
+      <w:tr>
+        <w:trPr>
+          <w:trHeight w:val="900"/>
+        </w:trPr>
+        <w:tc>
+          <w:tcPr>
+            <w:tcW w:w="2689" w:type="dxa"/>
+            <w:tcBorders>
+              <w:top w:val="nil"/>
+              <w:left w:val="single" w:sz="4" w:space="0" w:color="3E80A3"/>
+              <w:bottom w:val="single" w:sz="4" w:space="0" w:color="3E80A3"/>
+              <w:right w:val="single" w:sz="4" w:space="0" w:color="3E80A3"/>
+            </w:tcBorders>
+            <w:shd w:val="clear" w:color="0A1A2E" w:fill="FFFFFF"/>
+            <w:hideMark/>
+          </w:tcPr>
+          <w:p>
+            <w:pPr>
+              <w:spacing w:after="0" w:line="240" w:lineRule="auto"/>
+              <w:rPr>
+                <w:rFonts w:ascii="Calibri" w:eastAsia="Times New Roman" w:hAnsi="Calibri" w:cs="Calibri"/>
+                <w:color w:val="000000"/>
+                <w:lang w:eastAsia="ru-RU"/>
+              </w:rPr>
+            </w:pPr>
+            <w:proofErr w:type="spellStart"/>
+            <w:r>
+              <w:rPr>
+                <w:rFonts w:ascii="Calibri" w:eastAsia="Times New Roman" w:hAnsi="Calibri" w:cs="Calibri"/>
+                <w:color w:val="000000"/>
+                <w:lang w:eastAsia="ru-RU"/>
+              </w:rPr>
+              <w:t>Now-playing</w:t>
+            </w:r>
+            <w:proofErr w:type="spellEnd"/>
+            <w:r>
+              <w:rPr>
+                <w:rFonts w:ascii="Calibri" w:eastAsia="Times New Roman" w:hAnsi="Calibri" w:cs="Calibri"/>
+                <w:color w:val="000000"/>
+                <w:lang w:eastAsia="ru-RU"/>
+              </w:rPr>
+              <w:t xml:space="preserve"> панель</w:t>
+            </w:r>
+          </w:p>
+        </w:tc>
+        <w:tc>
+          <w:tcPr>
+            <w:tcW w:w="4252" w:type="dxa"/>
+            <w:tcBorders>
+              <w:top w:val="nil"/>
+              <w:left w:val="nil"/>
+              <w:bottom w:val="single" w:sz="4" w:space="0" w:color="3E80A3"/>
+              <w:right w:val="single" w:sz="4" w:space="0" w:color="3E80A3"/>
+            </w:tcBorders>
+            <w:shd w:val="clear" w:color="0A1A2E" w:fill="FFFFFF"/>
+            <w:hideMark/>
+          </w:tcPr>
+          <w:p>
+            <w:pPr>
+              <w:spacing w:after="0" w:line="240" w:lineRule="auto"/>
+              <w:rPr>
+                <w:rFonts w:ascii="Calibri" w:eastAsia="Times New Roman" w:hAnsi="Calibri" w:cs="Calibri"/>
+                <w:color w:val="000000"/>
+                <w:lang w:eastAsia="ru-RU"/>
+              </w:rPr>
+            </w:pPr>
+            <w:r>
+              <w:rPr>
+                <w:rFonts w:ascii="Calibri" w:eastAsia="Times New Roman" w:hAnsi="Calibri" w:cs="Calibri"/>
+                <w:color w:val="000000"/>
+                <w:lang w:eastAsia="ru-RU"/>
+              </w:rPr>
+              <w:t>#001a33 (BG_OVERLAY) + #215175 (BORDER)</w:t>
+            </w:r>
+          </w:p>
+        </w:tc>
+        <w:tc>
+          <w:tcPr>
+            <w:tcW w:w="3832" w:type="dxa"/>
+            <w:tcBorders>
+              <w:top w:val="nil"/>
+              <w:left w:val="nil"/>
+              <w:bottom w:val="single" w:sz="4" w:space="0" w:color="3E80A3"/>
+              <w:right w:val="single" w:sz="4" w:space="0" w:color="3E80A3"/>
+            </w:tcBorders>
+            <w:shd w:val="clear" w:color="0A1A2E" w:fill="FFFFFF"/>
+            <w:hideMark/>
+          </w:tcPr>
+          <w:p>
+            <w:pPr>
+              <w:spacing w:after="0" w:line="240" w:lineRule="auto"/>
+              <w:rPr>
+                <w:rFonts w:ascii="Calibri" w:eastAsia="Times New Roman" w:hAnsi="Calibri" w:cs="Calibri"/>
+                <w:color w:val="000000"/>
+                <w:lang w:eastAsia="ru-RU"/>
+              </w:rPr>
+            </w:pPr>
+            <w:r>
+              <w:rPr>
+                <w:rFonts w:ascii="Calibri" w:eastAsia="Times New Roman" w:hAnsi="Calibri" w:cs="Calibri"/>
+                <w:color w:val="000000"/>
+                <w:lang w:eastAsia="ru-RU"/>
+              </w:rPr>
+              <w:t xml:space="preserve">Нижняя панель с текущим треком, прогрессом и </w:t>
+            </w:r>
+            <w:proofErr w:type="spellStart"/>
+            <w:r>
+              <w:rPr>
+                <w:rFonts w:ascii="Calibri" w:eastAsia="Times New Roman" w:hAnsi="Calibri" w:cs="Calibri"/>
+                <w:color w:val="000000"/>
+                <w:lang w:eastAsia="ru-RU"/>
+              </w:rPr>
+              <w:t>контролами</w:t>
+            </w:r>
+            <w:proofErr w:type="spellEnd"/>
+          </w:p>
+        </w:tc>
+      </w:tr>
+      <w:tr>
+        <w:trPr>
+          <w:trHeight w:val="300"/>
+        </w:trPr>
+        <w:tc>
+          <w:tcPr>
+            <w:tcW w:w="2689" w:type="dxa"/>
+            <w:tcBorders>
+              <w:top w:val="nil"/>
+              <w:left w:val="single" w:sz="4" w:space="0" w:color="3E80A3"/>
+              <w:bottom w:val="single" w:sz="4" w:space="0" w:color="3E80A3"/>
+              <w:right w:val="single" w:sz="4" w:space="0" w:color="3E80A3"/>
+            </w:tcBorders>
+            <w:shd w:val="clear" w:color="12233A" w:fill="FFFFFF"/>
+            <w:hideMark/>
+          </w:tcPr>
+          <w:p>
+            <w:pPr>
+              <w:spacing w:after="0" w:line="240" w:lineRule="auto"/>
+              <w:rPr>
+                <w:rFonts w:ascii="Calibri" w:eastAsia="Times New Roman" w:hAnsi="Calibri" w:cs="Calibri"/>
+                <w:color w:val="000000"/>
+                <w:lang w:eastAsia="ru-RU"/>
+              </w:rPr>
+            </w:pPr>
+            <w:r>
+              <w:rPr>
+                <w:rFonts w:ascii="Calibri" w:eastAsia="Times New Roman" w:hAnsi="Calibri" w:cs="Calibri"/>
+                <w:color w:val="000000"/>
+                <w:lang w:eastAsia="ru-RU"/>
+              </w:rPr>
+              <w:t>Строки треков (обычные)</w:t>
+            </w:r>
+          </w:p>
+        </w:tc>
+        <w:tc>
+          <w:tcPr>
+            <w:tcW w:w="4252" w:type="dxa"/>
+            <w:tcBorders>
+              <w:top w:val="nil"/>
+              <w:left w:val="nil"/>
+              <w:bottom w:val="single" w:sz="4" w:space="0" w:color="3E80A3"/>
+              <w:right w:val="single" w:sz="4" w:space="0" w:color="3E80A3"/>
+            </w:tcBorders>
+            <w:shd w:val="clear" w:color="12233A" w:fill="FFFFFF"/>
+            <w:hideMark/>
+          </w:tcPr>
+          <w:p>
+            <w:pPr>
+              <w:spacing w:after="0" w:line="240" w:lineRule="auto"/>
+              <w:rPr>
+                <w:rFonts w:ascii="Calibri" w:eastAsia="Times New Roman" w:hAnsi="Calibri" w:cs="Calibri"/>
+                <w:color w:val="000000"/>
+                <w:lang w:eastAsia="ru-RU"/>
+              </w:rPr>
+            </w:pPr>
+            <w:r>
+              <w:rPr>
+                <w:rFonts w:ascii="Calibri" w:eastAsia="Times New Roman" w:hAnsi="Calibri" w:cs="Calibri"/>
+                <w:color w:val="000000"/>
+                <w:lang w:eastAsia="ru-RU"/>
+              </w:rPr>
+              <w:t>#12233a (BG_TRACK)</w:t>
+            </w:r>
+          </w:p>
+        </w:tc>
+        <w:tc>
+          <w:tcPr>
+            <w:tcW w:w="3832" w:type="dxa"/>
+            <w:tcBorders>
+              <w:top w:val="nil"/>
+              <w:left w:val="nil"/>
+              <w:bottom w:val="single" w:sz="4" w:space="0" w:color="3E80A3"/>
+              <w:right w:val="single" w:sz="4" w:space="0" w:color="3E80A3"/>
+            </w:tcBorders>
+            <w:shd w:val="clear" w:color="12233A" w:fill="FFFFFF"/>
+            <w:hideMark/>
+          </w:tcPr>
+          <w:p>
+            <w:pPr>
+              <w:spacing w:after="0" w:line="240" w:lineRule="auto"/>
+              <w:rPr>
+                <w:rFonts w:ascii="Calibri" w:eastAsia="Times New Roman" w:hAnsi="Calibri" w:cs="Calibri"/>
+                <w:color w:val="000000"/>
+                <w:lang w:eastAsia="ru-RU"/>
+              </w:rPr>
+            </w:pPr>
+            <w:r>
+              <w:rPr>
+                <w:rFonts w:ascii="Calibri" w:eastAsia="Times New Roman" w:hAnsi="Calibri" w:cs="Calibri"/>
+                <w:color w:val="000000"/>
+                <w:lang w:eastAsia="ru-RU"/>
+              </w:rPr>
+              <w:t>Фон строк в списке треков</w:t>
+            </w:r>
+          </w:p>
+        </w:tc>
+      </w:tr>
+      <w:tr>
+        <w:trPr>
+          <w:trHeight w:val="600"/>
+        </w:trPr>
+        <w:tc>
+          <w:tcPr>
+            <w:tcW w:w="2689" w:type="dxa"/>
+            <w:tcBorders>
+              <w:top w:val="nil"/>
+              <w:left w:val="single" w:sz="4" w:space="0" w:color="3E80A3"/>
+              <w:bottom w:val="single" w:sz="4" w:space="0" w:color="3E80A3"/>
+              <w:right w:val="single" w:sz="4" w:space="0" w:color="3E80A3"/>
+            </w:tcBorders>
+            <w:shd w:val="clear" w:color="0A1A2E" w:fill="FFFFFF"/>
+            <w:hideMark/>
+          </w:tcPr>
+          <w:p>
+            <w:pPr>
+              <w:spacing w:after="0" w:line="240" w:lineRule="auto"/>
+              <w:rPr>
+                <w:rFonts w:ascii="Calibri" w:eastAsia="Times New Roman" w:hAnsi="Calibri" w:cs="Calibri"/>
+                <w:color w:val="000000"/>
+                <w:lang w:eastAsia="ru-RU"/>
+              </w:rPr>
+            </w:pPr>
+            <w:r>
+              <w:rPr>
+                <w:rFonts w:ascii="Calibri" w:eastAsia="Times New Roman" w:hAnsi="Calibri" w:cs="Calibri"/>
+                <w:color w:val="000000"/>
+                <w:lang w:eastAsia="ru-RU"/>
+              </w:rPr>
+              <w:t>Строки треков (</w:t>
+            </w:r>
+            <w:proofErr w:type="spellStart"/>
+            <w:r>
+              <w:rPr>
+                <w:rFonts w:ascii="Calibri" w:eastAsia="Times New Roman" w:hAnsi="Calibri" w:cs="Calibri"/>
+                <w:color w:val="000000"/>
+                <w:lang w:eastAsia="ru-RU"/>
+              </w:rPr>
+              <w:t>hover</w:t>
+            </w:r>
+            <w:proofErr w:type="spellEnd"/>
+            <w:r>
+              <w:rPr>
+                <w:rFonts w:ascii="Calibri" w:eastAsia="Times New Roman" w:hAnsi="Calibri" w:cs="Calibri"/>
+                <w:color w:val="000000"/>
+                <w:lang w:eastAsia="ru-RU"/>
+              </w:rPr>
+              <w:t>)</w:t>
+            </w:r>
+          </w:p>
+        </w:tc>
+        <w:tc>
+          <w:tcPr>
+            <w:tcW w:w="4252" w:type="dxa"/>
+            <w:tcBorders>
+              <w:top w:val="nil"/>
+              <w:left w:val="nil"/>
+              <w:bottom w:val="single" w:sz="4" w:space="0" w:color="3E80A3"/>
+              <w:right w:val="single" w:sz="4" w:space="0" w:color="3E80A3"/>
+            </w:tcBorders>
+            <w:shd w:val="clear" w:color="0A1A2E" w:fill="FFFFFF"/>
+            <w:hideMark/>
+          </w:tcPr>
+          <w:p>
+            <w:pPr>
+              <w:spacing w:after="0" w:line="240" w:lineRule="auto"/>
+              <w:rPr>
+                <w:rFonts w:ascii="Calibri" w:eastAsia="Times New Roman" w:hAnsi="Calibri" w:cs="Calibri"/>
+                <w:color w:val="000000"/>
+                <w:lang w:eastAsia="ru-RU"/>
+              </w:rPr>
+            </w:pPr>
+            <w:r>
+              <w:rPr>
+                <w:rFonts w:ascii="Calibri" w:eastAsia="Times New Roman" w:hAnsi="Calibri" w:cs="Calibri"/>
+                <w:color w:val="000000"/>
+                <w:lang w:eastAsia="ru-RU"/>
+              </w:rPr>
+              <w:t>#18304f (BG_TRACK_HOVER)</w:t>
+            </w:r>
+          </w:p>
+        </w:tc>
+        <w:tc>
+          <w:tcPr>
+            <w:tcW w:w="3832" w:type="dxa"/>
+            <w:tcBorders>
+              <w:top w:val="nil"/>
+              <w:left w:val="nil"/>
+              <w:bottom w:val="single" w:sz="4" w:space="0" w:color="3E80A3"/>
+              <w:right w:val="single" w:sz="4" w:space="0" w:color="3E80A3"/>
+            </w:tcBorders>
+            <w:shd w:val="clear" w:color="0A1A2E" w:fill="FFFFFF"/>
+            <w:hideMark/>
+          </w:tcPr>
+          <w:p>
+            <w:pPr>
+              <w:spacing w:after="0" w:line="240" w:lineRule="auto"/>
+              <w:rPr>
+                <w:rFonts w:ascii="Calibri" w:eastAsia="Times New Roman" w:hAnsi="Calibri" w:cs="Calibri"/>
+                <w:color w:val="000000"/>
+                <w:lang w:eastAsia="ru-RU"/>
+              </w:rPr>
+            </w:pPr>
+            <w:r>
+              <w:rPr>
+                <w:rFonts w:ascii="Calibri" w:eastAsia="Times New Roman" w:hAnsi="Calibri" w:cs="Calibri"/>
+                <w:color w:val="000000"/>
+                <w:lang w:eastAsia="ru-RU"/>
+              </w:rPr>
+              <w:t>Подсветка строки при наведении мыши</w:t>
+            </w:r>
+          </w:p>
+        </w:tc>
+      </w:tr>
+      <w:tr>
+        <w:trPr>
+          <w:trHeight w:val="300"/>
+        </w:trPr>
+        <w:tc>
+          <w:tcPr>
+            <w:tcW w:w="2689" w:type="dxa"/>
+            <w:tcBorders>
+              <w:top w:val="nil"/>
+              <w:left w:val="single" w:sz="4" w:space="0" w:color="3E80A3"/>
+              <w:bottom w:val="single" w:sz="4" w:space="0" w:color="3E80A3"/>
+              <w:right w:val="single" w:sz="4" w:space="0" w:color="3E80A3"/>
+            </w:tcBorders>
+            <w:shd w:val="clear" w:color="12233A" w:fill="FFFFFF"/>
+            <w:hideMark/>
+          </w:tcPr>
+          <w:p>
+            <w:pPr>
+              <w:spacing w:after="0" w:line="240" w:lineRule="auto"/>
+              <w:rPr>
+                <w:rFonts w:ascii="Calibri" w:eastAsia="Times New Roman" w:hAnsi="Calibri" w:cs="Calibri"/>
+                <w:color w:val="000000"/>
+                <w:lang w:eastAsia="ru-RU"/>
+              </w:rPr>
+            </w:pPr>
+            <w:r>
+              <w:rPr>
+                <w:rFonts w:ascii="Calibri" w:eastAsia="Times New Roman" w:hAnsi="Calibri" w:cs="Calibri"/>
+                <w:color w:val="000000"/>
+                <w:lang w:eastAsia="ru-RU"/>
+              </w:rPr>
+              <w:t>Строки треков (выделенные)</w:t>
+            </w:r>
+          </w:p>
+        </w:tc>
+        <w:tc>
+          <w:tcPr>
+            <w:tcW w:w="4252" w:type="dxa"/>
+            <w:tcBorders>
+              <w:top w:val="nil"/>
+              <w:left w:val="nil"/>
+              <w:bottom w:val="single" w:sz="4" w:space="0" w:color="3E80A3"/>
+              <w:right w:val="single" w:sz="4" w:space="0" w:color="3E80A3"/>
+            </w:tcBorders>
+            <w:shd w:val="clear" w:color="12233A" w:fill="FFFFFF"/>
+            <w:hideMark/>
+          </w:tcPr>
+          <w:p>
+            <w:pPr>
+              <w:spacing w:after="0" w:line="240" w:lineRule="auto"/>
+              <w:rPr>
+                <w:rFonts w:ascii="Calibri" w:eastAsia="Times New Roman" w:hAnsi="Calibri" w:cs="Calibri"/>
+                <w:color w:val="000000"/>
+                <w:lang w:eastAsia="ru-RU"/>
+              </w:rPr>
+            </w:pPr>
+            <w:r>
+              <w:rPr>
+                <w:rFonts w:ascii="Calibri" w:eastAsia="Times New Roman" w:hAnsi="Calibri" w:cs="Calibri"/>
+                <w:color w:val="000000"/>
+                <w:lang w:eastAsia="ru-RU"/>
+              </w:rPr>
+              <w:t>#1e3a5f (BG_TRACK_SELECTED)</w:t>
+            </w:r>
+          </w:p>
+        </w:tc>
+        <w:tc>
+          <w:tcPr>
+            <w:tcW w:w="3832" w:type="dxa"/>
+            <w:tcBorders>
+              <w:top w:val="nil"/>
+              <w:left w:val="nil"/>
+              <w:bottom w:val="single" w:sz="4" w:space="0" w:color="3E80A3"/>
+              <w:right w:val="single" w:sz="4" w:space="0" w:color="3E80A3"/>
+            </w:tcBorders>
+            <w:shd w:val="clear" w:color="12233A" w:fill="FFFFFF"/>
+            <w:hideMark/>
+          </w:tcPr>
+          <w:p>
+            <w:pPr>
+              <w:spacing w:after="0" w:line="240" w:lineRule="auto"/>
+              <w:rPr>
+                <w:rFonts w:ascii="Calibri" w:eastAsia="Times New Roman" w:hAnsi="Calibri" w:cs="Calibri"/>
+                <w:color w:val="000000"/>
+                <w:lang w:eastAsia="ru-RU"/>
+              </w:rPr>
+            </w:pPr>
+            <w:r>
+              <w:rPr>
+                <w:rFonts w:ascii="Calibri" w:eastAsia="Times New Roman" w:hAnsi="Calibri" w:cs="Calibri"/>
+                <w:color w:val="000000"/>
+                <w:lang w:eastAsia="ru-RU"/>
+              </w:rPr>
+              <w:t>Выделенная строка</w:t>
+            </w:r>
+          </w:p>
+        </w:tc>
+      </w:tr>
+      <w:tr>
+        <w:trPr>
+          <w:trHeight w:val="600"/>
+        </w:trPr>
+        <w:tc>
+          <w:tcPr>
+            <w:tcW w:w="2689" w:type="dxa"/>
+            <w:tcBorders>
+              <w:top w:val="nil"/>
+              <w:left w:val="single" w:sz="4" w:space="0" w:color="3E80A3"/>
+              <w:bottom w:val="single" w:sz="4" w:space="0" w:color="3E80A3"/>
+              <w:right w:val="single" w:sz="4" w:space="0" w:color="3E80A3"/>
+            </w:tcBorders>
+            <w:shd w:val="clear" w:color="0A1A2E" w:fill="FFFFFF"/>
+            <w:hideMark/>
+          </w:tcPr>
+          <w:p>
+            <w:pPr>
+              <w:spacing w:after="0" w:line="240" w:lineRule="auto"/>
+              <w:rPr>
+                <w:rFonts w:ascii="Calibri" w:eastAsia="Times New Roman" w:hAnsi="Calibri" w:cs="Calibri"/>
+                <w:color w:val="000000"/>
+                <w:lang w:eastAsia="ru-RU"/>
+              </w:rPr>
+            </w:pPr>
+            <w:r>
+              <w:rPr>
+                <w:rFonts w:ascii="Calibri" w:eastAsia="Times New Roman" w:hAnsi="Calibri" w:cs="Calibri"/>
+                <w:color w:val="000000"/>
+                <w:lang w:eastAsia="ru-RU"/>
+              </w:rPr>
+              <w:t>Играющая строка</w:t>
+            </w:r>
+          </w:p>
+        </w:tc>
+        <w:tc>
+          <w:tcPr>
+            <w:tcW w:w="4252" w:type="dxa"/>
+            <w:tcBorders>
+              <w:top w:val="nil"/>
+              <w:left w:val="nil"/>
+              <w:bottom w:val="single" w:sz="4" w:space="0" w:color="3E80A3"/>
+              <w:right w:val="single" w:sz="4" w:space="0" w:color="3E80A3"/>
+            </w:tcBorders>
+            <w:shd w:val="clear" w:color="0A1A2E" w:fill="FFFFFF"/>
+            <w:hideMark/>
+          </w:tcPr>
+          <w:p>
+            <w:pPr>
+              <w:spacing w:after="0" w:line="240" w:lineRule="auto"/>
+              <w:rPr>
+                <w:rFonts w:ascii="Calibri" w:eastAsia="Times New Roman" w:hAnsi="Calibri" w:cs="Calibri"/>
+                <w:color w:val="000000"/>
+                <w:lang w:eastAsia="ru-RU"/>
+              </w:rPr>
+            </w:pPr>
+            <w:r>
+              <w:rPr>
+                <w:rFonts w:ascii="Calibri" w:eastAsia="Times New Roman" w:hAnsi="Calibri" w:cs="Calibri"/>
+                <w:color w:val="000000"/>
+                <w:lang w:eastAsia="ru-RU"/>
+              </w:rPr>
+              <w:t>#215175 (</w:t>
+            </w:r>
+            <w:proofErr w:type="spellStart"/>
+            <w:r>
+              <w:rPr>
+                <w:rFonts w:ascii="Calibri" w:eastAsia="Times New Roman" w:hAnsi="Calibri" w:cs="Calibri"/>
+                <w:color w:val="000000"/>
+                <w:lang w:eastAsia="ru-RU"/>
+              </w:rPr>
+              <w:t>bg</w:t>
+            </w:r>
+            <w:proofErr w:type="spellEnd"/>
+            <w:r>
+              <w:rPr>
+                <w:rFonts w:ascii="Calibri" w:eastAsia="Times New Roman" w:hAnsi="Calibri" w:cs="Calibri"/>
+                <w:color w:val="000000"/>
+                <w:lang w:eastAsia="ru-RU"/>
+              </w:rPr>
+              <w:t>) + #00bfff (номер)</w:t>
+            </w:r>
+          </w:p>
+        </w:tc>
+        <w:tc>
+          <w:tcPr>
+            <w:tcW w:w="3832" w:type="dxa"/>
+            <w:tcBorders>
+              <w:top w:val="nil"/>
+              <w:left w:val="nil"/>
+              <w:bottom w:val="single" w:sz="4" w:space="0" w:color="3E80A3"/>
+              <w:right w:val="single" w:sz="4" w:space="0" w:color="3E80A3"/>
+            </w:tcBorders>
+            <w:shd w:val="clear" w:color="0A1A2E" w:fill="FFFFFF"/>
+            <w:hideMark/>
+          </w:tcPr>
+          <w:p>
+            <w:pPr>
+              <w:spacing w:after="0" w:line="240" w:lineRule="auto"/>
+              <w:rPr>
+                <w:rFonts w:ascii="Calibri" w:eastAsia="Times New Roman" w:hAnsi="Calibri" w:cs="Calibri"/>
+                <w:color w:val="000000"/>
+                <w:lang w:eastAsia="ru-RU"/>
+              </w:rPr>
+            </w:pPr>
+            <w:r>
+              <w:rPr>
+                <w:rFonts w:ascii="Calibri" w:eastAsia="Times New Roman" w:hAnsi="Calibri" w:cs="Calibri"/>
+                <w:color w:val="000000"/>
+                <w:lang w:eastAsia="ru-RU"/>
+              </w:rPr>
+              <w:t>Фон и цвет номера текущего воспроизводимого трека</w:t>
+            </w:r>
+          </w:p>
+        </w:tc>
+      </w:tr>
+      <w:tr>
+        <w:trPr>
+          <w:trHeight w:val="600"/>
+        </w:trPr>
+        <w:tc>
+          <w:tcPr>
+            <w:tcW w:w="2689" w:type="dxa"/>
+            <w:tcBorders>
+              <w:top w:val="nil"/>
+              <w:left w:val="single" w:sz="4" w:space="0" w:color="3E80A3"/>
+              <w:bottom w:val="single" w:sz="4" w:space="0" w:color="3E80A3"/>
+              <w:right w:val="single" w:sz="4" w:space="0" w:color="3E80A3"/>
+            </w:tcBorders>
+            <w:shd w:val="clear" w:color="12233A" w:fill="FFFFFF"/>
+            <w:hideMark/>
+          </w:tcPr>
+          <w:p>
+            <w:pPr>
+              <w:spacing w:after="0" w:line="240" w:lineRule="auto"/>
+              <w:rPr>
+                <w:rFonts w:ascii="Calibri" w:eastAsia="Times New Roman" w:hAnsi="Calibri" w:cs="Calibri"/>
+                <w:color w:val="000000"/>
+                <w:lang w:eastAsia="ru-RU"/>
+              </w:rPr>
+            </w:pPr>
+            <w:r>
+              <w:rPr>
+                <w:rFonts w:ascii="Calibri" w:eastAsia="Times New Roman" w:hAnsi="Calibri" w:cs="Calibri"/>
+                <w:color w:val="000000"/>
+                <w:lang w:eastAsia="ru-RU"/>
+              </w:rPr>
+              <w:t>Обычные кнопки (фон)</w:t>
+            </w:r>
+          </w:p>
+        </w:tc>
+        <w:tc>
+          <w:tcPr>
+            <w:tcW w:w="4252" w:type="dxa"/>
+            <w:tcBorders>
+              <w:top w:val="nil"/>
+              <w:left w:val="nil"/>
+              <w:bottom w:val="single" w:sz="4" w:space="0" w:color="3E80A3"/>
+              <w:right w:val="single" w:sz="4" w:space="0" w:color="3E80A3"/>
+            </w:tcBorders>
+            <w:shd w:val="clear" w:color="12233A" w:fill="FFFFFF"/>
+            <w:hideMark/>
+          </w:tcPr>
+          <w:p>
+            <w:pPr>
+              <w:spacing w:after="0" w:line="240" w:lineRule="auto"/>
+              <w:rPr>
+                <w:rFonts w:ascii="Calibri" w:eastAsia="Times New Roman" w:hAnsi="Calibri" w:cs="Calibri"/>
+                <w:color w:val="000000"/>
+                <w:lang w:eastAsia="ru-RU"/>
+              </w:rPr>
+            </w:pPr>
+            <w:r>
+              <w:rPr>
+                <w:rFonts w:ascii="Calibri" w:eastAsia="Times New Roman" w:hAnsi="Calibri" w:cs="Calibri"/>
+                <w:color w:val="000000"/>
+                <w:lang w:eastAsia="ru-RU"/>
+              </w:rPr>
+              <w:t>#215175 (BTN_BG)</w:t>
+            </w:r>
+          </w:p>
+        </w:tc>
+        <w:tc>
+          <w:tcPr>
+            <w:tcW w:w="3832" w:type="dxa"/>
+            <w:tcBorders>
+              <w:top w:val="nil"/>
+              <w:left w:val="nil"/>
+              <w:bottom w:val="single" w:sz="4" w:space="0" w:color="3E80A3"/>
+              <w:right w:val="single" w:sz="4" w:space="0" w:color="3E80A3"/>
+            </w:tcBorders>
+            <w:shd w:val="clear" w:color="12233A" w:fill="FFFFFF"/>
+            <w:hideMark/>
+          </w:tcPr>
+          <w:p>
+            <w:pPr>
+              <w:spacing w:after="0" w:line="240" w:lineRule="auto"/>
+              <w:rPr>
+                <w:rFonts w:ascii="Calibri" w:eastAsia="Times New Roman" w:hAnsi="Calibri" w:cs="Calibri"/>
+                <w:color w:val="000000"/>
+                <w:lang w:eastAsia="ru-RU"/>
+              </w:rPr>
+            </w:pPr>
+            <w:r>
+              <w:rPr>
+                <w:rFonts w:ascii="Calibri" w:eastAsia="Times New Roman" w:hAnsi="Calibri" w:cs="Calibri"/>
+                <w:color w:val="000000"/>
+                <w:lang w:eastAsia="ru-RU"/>
+              </w:rPr>
+              <w:t>Фон кнопок (удалить плейлист, обновления, откат и т.д.)</w:t>
+            </w:r>
+          </w:p>
+        </w:tc>
+      </w:tr>
+      <w:tr>
+        <w:trPr>
+          <w:trHeight w:val="300"/>
+        </w:trPr>
+        <w:tc>
+          <w:tcPr>
+            <w:tcW w:w="2689" w:type="dxa"/>
+            <w:tcBorders>
+              <w:top w:val="nil"/>
+              <w:left w:val="single" w:sz="4" w:space="0" w:color="3E80A3"/>
+              <w:bottom w:val="single" w:sz="4" w:space="0" w:color="3E80A3"/>
+              <w:right w:val="single" w:sz="4" w:space="0" w:color="3E80A3"/>
+            </w:tcBorders>
+            <w:shd w:val="clear" w:color="0A1A2E" w:fill="FFFFFF"/>
+            <w:hideMark/>
+          </w:tcPr>
+          <w:p>
+            <w:pPr>
+              <w:spacing w:after="0" w:line="240" w:lineRule="auto"/>
+              <w:rPr>
+                <w:rFonts w:ascii="Calibri" w:eastAsia="Times New Roman" w:hAnsi="Calibri" w:cs="Calibri"/>
+                <w:color w:val="000000"/>
+                <w:lang w:eastAsia="ru-RU"/>
+              </w:rPr>
+            </w:pPr>
+            <w:r>
+              <w:rPr>
+                <w:rFonts w:ascii="Calibri" w:eastAsia="Times New Roman" w:hAnsi="Calibri" w:cs="Calibri"/>
+                <w:color w:val="000000"/>
+                <w:lang w:eastAsia="ru-RU"/>
+              </w:rPr>
+              <w:t>Обычные кнопки (</w:t>
+            </w:r>
+            <w:proofErr w:type="spellStart"/>
+            <w:r>
+              <w:rPr>
+                <w:rFonts w:ascii="Calibri" w:eastAsia="Times New Roman" w:hAnsi="Calibri" w:cs="Calibri"/>
+                <w:color w:val="000000"/>
+                <w:lang w:eastAsia="ru-RU"/>
+              </w:rPr>
+              <w:t>hover</w:t>
+            </w:r>
+            <w:proofErr w:type="spellEnd"/>
+            <w:r>
+              <w:rPr>
+                <w:rFonts w:ascii="Calibri" w:eastAsia="Times New Roman" w:hAnsi="Calibri" w:cs="Calibri"/>
+                <w:color w:val="000000"/>
+                <w:lang w:eastAsia="ru-RU"/>
+              </w:rPr>
+              <w:t>)</w:t>
+            </w:r>
+          </w:p>
+        </w:tc>
+        <w:tc>
+          <w:tcPr>
+            <w:tcW w:w="4252" w:type="dxa"/>
+            <w:tcBorders>
+              <w:top w:val="nil"/>
+              <w:left w:val="nil"/>
+              <w:bottom w:val="single" w:sz="4" w:space="0" w:color="3E80A3"/>
+              <w:right w:val="single" w:sz="4" w:space="0" w:color="3E80A3"/>
+            </w:tcBorders>
+            <w:shd w:val="clear" w:color="0A1A2E" w:fill="FFFFFF"/>
+            <w:hideMark/>
+          </w:tcPr>
+          <w:p>
+            <w:pPr>
+              <w:spacing w:after="0" w:line="240" w:lineRule="auto"/>
+              <w:rPr>
+                <w:rFonts w:ascii="Calibri" w:eastAsia="Times New Roman" w:hAnsi="Calibri" w:cs="Calibri"/>
+                <w:color w:val="000000"/>
+                <w:lang w:eastAsia="ru-RU"/>
+              </w:rPr>
+            </w:pPr>
+            <w:r>
+              <w:rPr>
+                <w:rFonts w:ascii="Calibri" w:eastAsia="Times New Roman" w:hAnsi="Calibri" w:cs="Calibri"/>
+                <w:color w:val="000000"/>
+                <w:lang w:eastAsia="ru-RU"/>
+              </w:rPr>
+              <w:t>#3e80a3 (BTN_HOVER)</w:t>
+            </w:r>
+          </w:p>
+        </w:tc>
+        <w:tc>
+          <w:tcPr>
+            <w:tcW w:w="3832" w:type="dxa"/>
+            <w:tcBorders>
+              <w:top w:val="nil"/>
+              <w:left w:val="nil"/>
+              <w:bottom w:val="single" w:sz="4" w:space="0" w:color="3E80A3"/>
+              <w:right w:val="single" w:sz="4" w:space="0" w:color="3E80A3"/>
+            </w:tcBorders>
+            <w:shd w:val="clear" w:color="0A1A2E" w:fill="FFFFFF"/>
+            <w:hideMark/>
+          </w:tcPr>
+          <w:p>
+            <w:pPr>
+              <w:spacing w:after="0" w:line="240" w:lineRule="auto"/>
+              <w:rPr>
+                <w:rFonts w:ascii="Calibri" w:eastAsia="Times New Roman" w:hAnsi="Calibri" w:cs="Calibri"/>
+                <w:color w:val="000000"/>
+                <w:lang w:eastAsia="ru-RU"/>
+              </w:rPr>
+            </w:pPr>
+            <w:proofErr w:type="spellStart"/>
+            <w:r>
+              <w:rPr>
+                <w:rFonts w:ascii="Calibri" w:eastAsia="Times New Roman" w:hAnsi="Calibri" w:cs="Calibri"/>
+                <w:color w:val="000000"/>
+                <w:lang w:eastAsia="ru-RU"/>
+              </w:rPr>
+              <w:t>Hover</w:t>
+            </w:r>
+            <w:proofErr w:type="spellEnd"/>
+            <w:r>
+              <w:rPr>
+                <w:rFonts w:ascii="Calibri" w:eastAsia="Times New Roman" w:hAnsi="Calibri" w:cs="Calibri"/>
+                <w:color w:val="000000"/>
+                <w:lang w:eastAsia="ru-RU"/>
+              </w:rPr>
+              <w:t xml:space="preserve"> для обычных кнопок</w:t>
+            </w:r>
+          </w:p>
+        </w:tc>
+      </w:tr>
+      <w:tr>
+        <w:trPr>
+          <w:trHeight w:val="600"/>
+        </w:trPr>
+        <w:tc>
+          <w:tcPr>
+            <w:tcW w:w="2689" w:type="dxa"/>
+            <w:tcBorders>
+              <w:top w:val="nil"/>
+              <w:left w:val="single" w:sz="4" w:space="0" w:color="3E80A3"/>
+              <w:bottom w:val="single" w:sz="4" w:space="0" w:color="3E80A3"/>
+              <w:right w:val="single" w:sz="4" w:space="0" w:color="3E80A3"/>
+            </w:tcBorders>
+            <w:shd w:val="clear" w:color="12233A" w:fill="FFFFFF"/>
+            <w:hideMark/>
+          </w:tcPr>
+          <w:p>
+            <w:pPr>
+              <w:spacing w:after="0" w:line="240" w:lineRule="auto"/>
+              <w:rPr>
+                <w:rFonts w:ascii="Calibri" w:eastAsia="Times New Roman" w:hAnsi="Calibri" w:cs="Calibri"/>
+                <w:color w:val="000000"/>
+                <w:lang w:eastAsia="ru-RU"/>
+              </w:rPr>
+            </w:pPr>
+            <w:proofErr w:type="spellStart"/>
+            <w:r>
+              <w:rPr>
+                <w:rFonts w:ascii="Calibri" w:eastAsia="Times New Roman" w:hAnsi="Calibri" w:cs="Calibri"/>
+                <w:color w:val="000000"/>
+                <w:lang w:eastAsia="ru-RU"/>
+              </w:rPr>
+              <w:t>Primary</w:t>
+            </w:r>
+            <w:proofErr w:type="spellEnd"/>
+            <w:r>
+              <w:rPr>
+                <w:rFonts w:ascii="Calibri" w:eastAsia="Times New Roman" w:hAnsi="Calibri" w:cs="Calibri"/>
+                <w:color w:val="000000"/>
+                <w:lang w:eastAsia="ru-RU"/>
+              </w:rPr>
+              <w:t xml:space="preserve"> кнопки (Воспроизвести</w:t>
+            </w:r>
+            <w:proofErr w:type="gramStart"/>
+            <w:r>
+              <w:rPr>
+                <w:rFonts w:ascii="Calibri" w:eastAsia="Times New Roman" w:hAnsi="Calibri" w:cs="Calibri"/>
+                <w:color w:val="000000"/>
+                <w:lang w:eastAsia="ru-RU"/>
+              </w:rPr>
+              <w:t>, Случайно</w:t>
+            </w:r>
+            <w:proofErr w:type="gramEnd"/>
+            <w:r>
+              <w:rPr>
+                <w:rFonts w:ascii="Calibri" w:eastAsia="Times New Roman" w:hAnsi="Calibri" w:cs="Calibri"/>
+                <w:color w:val="000000"/>
+                <w:lang w:eastAsia="ru-RU"/>
+              </w:rPr>
+              <w:t>)</w:t>
+            </w:r>
+          </w:p>
+        </w:tc>
+        <w:tc>
+          <w:tcPr>
+            <w:tcW w:w="4252" w:type="dxa"/>
+            <w:tcBorders>
+              <w:top w:val="nil"/>
+              <w:left w:val="nil"/>
+              <w:bottom w:val="single" w:sz="4" w:space="0" w:color="3E80A3"/>
+              <w:right w:val="single" w:sz="4" w:space="0" w:color="3E80A3"/>
+            </w:tcBorders>
+            <w:shd w:val="clear" w:color="12233A" w:fill="FFFFFF"/>
+            <w:hideMark/>
+          </w:tcPr>
+          <w:p>
+            <w:pPr>
+              <w:spacing w:after="0" w:line="240" w:lineRule="auto"/>
+              <w:rPr>
+                <w:rFonts w:ascii="Calibri" w:eastAsia="Times New Roman" w:hAnsi="Calibri" w:cs="Calibri"/>
+                <w:color w:val="000000"/>
+                <w:lang w:eastAsia="ru-RU"/>
+              </w:rPr>
+            </w:pPr>
+            <w:r>
+              <w:rPr>
+                <w:rFonts w:ascii="Calibri" w:eastAsia="Times New Roman" w:hAnsi="Calibri" w:cs="Calibri"/>
+                <w:color w:val="000000"/>
+                <w:lang w:eastAsia="ru-RU"/>
+              </w:rPr>
+              <w:t>#3e80a3 (фон) / #00bfff (</w:t>
+            </w:r>
+            <w:proofErr w:type="spellStart"/>
+            <w:r>
+              <w:rPr>
+                <w:rFonts w:ascii="Calibri" w:eastAsia="Times New Roman" w:hAnsi="Calibri" w:cs="Calibri"/>
+                <w:color w:val="000000"/>
+                <w:lang w:eastAsia="ru-RU"/>
+              </w:rPr>
+              <w:t>hover</w:t>
+            </w:r>
+            <w:proofErr w:type="spellEnd"/>
+            <w:r>
+              <w:rPr>
+                <w:rFonts w:ascii="Calibri" w:eastAsia="Times New Roman" w:hAnsi="Calibri" w:cs="Calibri"/>
+                <w:color w:val="000000"/>
+                <w:lang w:eastAsia="ru-RU"/>
+              </w:rPr>
+              <w:t>)</w:t>
+            </w:r>
+          </w:p>
+        </w:tc>
+        <w:tc>
+          <w:tcPr>
+            <w:tcW w:w="3832" w:type="dxa"/>
+            <w:tcBorders>
+              <w:top w:val="nil"/>
+              <w:left w:val="nil"/>
+              <w:bottom w:val="single" w:sz="4" w:space="0" w:color="3E80A3"/>
+              <w:right w:val="single" w:sz="4" w:space="0" w:color="3E80A3"/>
+            </w:tcBorders>
+            <w:shd w:val="clear" w:color="12233A" w:fill="FFFFFF"/>
+            <w:hideMark/>
+          </w:tcPr>
+          <w:p>
+            <w:pPr>
+              <w:spacing w:after="0" w:line="240" w:lineRule="auto"/>
+              <w:rPr>
+                <w:rFonts w:ascii="Calibri" w:eastAsia="Times New Roman" w:hAnsi="Calibri" w:cs="Calibri"/>
+                <w:color w:val="000000"/>
+                <w:lang w:eastAsia="ru-RU"/>
+              </w:rPr>
+            </w:pPr>
+            <w:r>
+              <w:rPr>
+                <w:rFonts w:ascii="Calibri" w:eastAsia="Times New Roman" w:hAnsi="Calibri" w:cs="Calibri"/>
+                <w:color w:val="000000"/>
+                <w:lang w:eastAsia="ru-RU"/>
+              </w:rPr>
+              <w:t>Основные кнопки воспроизведения</w:t>
+            </w:r>
+          </w:p>
+        </w:tc>
+      </w:tr>
+      <w:tr>
+        <w:trPr>
+          <w:trHeight w:val="600"/>
+        </w:trPr>
+        <w:tc>
+          <w:tcPr>
+            <w:tcW w:w="2689" w:type="dxa"/>
+            <w:tcBorders>
+              <w:top w:val="nil"/>
+              <w:left w:val="single" w:sz="4" w:space="0" w:color="3E80A3"/>
+              <w:bottom w:val="single" w:sz="4" w:space="0" w:color="3E80A3"/>
+              <w:right w:val="single" w:sz="4" w:space="0" w:color="3E80A3"/>
+            </w:tcBorders>
+            <w:shd w:val="clear" w:color="0A1A2E" w:fill="FFFFFF"/>
+            <w:hideMark/>
+          </w:tcPr>
+          <w:p>
+            <w:pPr>
+              <w:spacing w:after="0" w:line="240" w:lineRule="auto"/>
+              <w:rPr>
+                <w:rFonts w:ascii="Calibri" w:eastAsia="Times New Roman" w:hAnsi="Calibri" w:cs="Calibri"/>
+                <w:color w:val="000000"/>
+                <w:lang w:eastAsia="ru-RU"/>
+              </w:rPr>
+            </w:pPr>
+            <w:r>
+              <w:rPr>
+                <w:rFonts w:ascii="Calibri" w:eastAsia="Times New Roman" w:hAnsi="Calibri" w:cs="Calibri"/>
+                <w:color w:val="000000"/>
+                <w:lang w:eastAsia="ru-RU"/>
+              </w:rPr>
+              <w:t>Прогресс-бар</w:t>
+            </w:r>
+          </w:p>
+        </w:tc>
+        <w:tc>
+          <w:tcPr>
+            <w:tcW w:w="4252" w:type="dxa"/>
+            <w:tcBorders>
+              <w:top w:val="nil"/>
+              <w:left w:val="nil"/>
+              <w:bottom w:val="single" w:sz="4" w:space="0" w:color="3E80A3"/>
+              <w:right w:val="single" w:sz="4" w:space="0" w:color="3E80A3"/>
+            </w:tcBorders>
+            <w:shd w:val="clear" w:color="0A1A2E" w:fill="FFFFFF"/>
+            <w:hideMark/>
+          </w:tcPr>
+          <w:p>
+            <w:pPr>
+              <w:spacing w:after="0" w:line="240" w:lineRule="auto"/>
+              <w:rPr>
+                <w:rFonts w:ascii="Calibri" w:eastAsia="Times New Roman" w:hAnsi="Calibri" w:cs="Calibri"/>
+                <w:color w:val="000000"/>
+                <w:lang w:eastAsia="ru-RU"/>
+              </w:rPr>
+            </w:pPr>
+            <w:r>
+              <w:rPr>
+                <w:rFonts w:ascii="Calibri" w:eastAsia="Times New Roman" w:hAnsi="Calibri" w:cs="Calibri"/>
+                <w:color w:val="000000"/>
+                <w:lang w:eastAsia="ru-RU"/>
+              </w:rPr>
+              <w:t>#1a2a47 (</w:t>
+            </w:r>
+            <w:proofErr w:type="spellStart"/>
+            <w:r>
+              <w:rPr>
+                <w:rFonts w:ascii="Calibri" w:eastAsia="Times New Roman" w:hAnsi="Calibri" w:cs="Calibri"/>
+                <w:color w:val="000000"/>
+                <w:lang w:eastAsia="ru-RU"/>
+              </w:rPr>
+              <w:t>bg</w:t>
+            </w:r>
+            <w:proofErr w:type="spellEnd"/>
+            <w:r>
+              <w:rPr>
+                <w:rFonts w:ascii="Calibri" w:eastAsia="Times New Roman" w:hAnsi="Calibri" w:cs="Calibri"/>
+                <w:color w:val="000000"/>
+                <w:lang w:eastAsia="ru-RU"/>
+              </w:rPr>
+              <w:t>) / #00bfff (</w:t>
+            </w:r>
+            <w:proofErr w:type="spellStart"/>
+            <w:r>
+              <w:rPr>
+                <w:rFonts w:ascii="Calibri" w:eastAsia="Times New Roman" w:hAnsi="Calibri" w:cs="Calibri"/>
+                <w:color w:val="000000"/>
+                <w:lang w:eastAsia="ru-RU"/>
+              </w:rPr>
+              <w:t>fill</w:t>
+            </w:r>
+            <w:proofErr w:type="spellEnd"/>
+            <w:r>
+              <w:rPr>
+                <w:rFonts w:ascii="Calibri" w:eastAsia="Times New Roman" w:hAnsi="Calibri" w:cs="Calibri"/>
+                <w:color w:val="000000"/>
+                <w:lang w:eastAsia="ru-RU"/>
+              </w:rPr>
+              <w:t>)</w:t>
+            </w:r>
+          </w:p>
+        </w:tc>
+        <w:tc>
+          <w:tcPr>
+            <w:tcW w:w="3832" w:type="dxa"/>
+            <w:tcBorders>
+              <w:top w:val="nil"/>
+              <w:left w:val="nil"/>
+              <w:bottom w:val="single" w:sz="4" w:space="0" w:color="3E80A3"/>
+              <w:right w:val="single" w:sz="4" w:space="0" w:color="3E80A3"/>
+            </w:tcBorders>
+            <w:shd w:val="clear" w:color="0A1A2E" w:fill="FFFFFF"/>
+            <w:hideMark/>
+          </w:tcPr>
+          <w:p>
+            <w:pPr>
+              <w:spacing w:after="0" w:line="240" w:lineRule="auto"/>
+              <w:rPr>
+                <w:rFonts w:ascii="Calibri" w:eastAsia="Times New Roman" w:hAnsi="Calibri" w:cs="Calibri"/>
+                <w:color w:val="000000"/>
+                <w:lang w:eastAsia="ru-RU"/>
+              </w:rPr>
+            </w:pPr>
+            <w:r>
+              <w:rPr>
+                <w:rFonts w:ascii="Calibri" w:eastAsia="Times New Roman" w:hAnsi="Calibri" w:cs="Calibri"/>
+                <w:color w:val="000000"/>
+                <w:lang w:eastAsia="ru-RU"/>
+              </w:rPr>
+              <w:t>Слайдер прогресса воспроизведения</w:t>
+            </w:r>
+          </w:p>
+        </w:tc>
+      </w:tr>
+      <w:tr>
+        <w:trPr>
+          <w:trHeight w:val="600"/>
+        </w:trPr>
+        <w:tc>
+          <w:tcPr>
+            <w:tcW w:w="2689" w:type="dxa"/>
+            <w:tcBorders>
+              <w:top w:val="nil"/>
+              <w:left w:val="single" w:sz="4" w:space="0" w:color="3E80A3"/>
+              <w:bottom w:val="single" w:sz="4" w:space="0" w:color="3E80A3"/>
+              <w:right w:val="single" w:sz="4" w:space="0" w:color="3E80A3"/>
+            </w:tcBorders>
+            <w:shd w:val="clear" w:color="12233A" w:fill="FFFFFF"/>
+            <w:hideMark/>
+          </w:tcPr>
+          <w:p>
+            <w:pPr>
+              <w:spacing w:after="0" w:line="240" w:lineRule="auto"/>
+              <w:rPr>
+                <w:rFonts w:ascii="Calibri" w:eastAsia="Times New Roman" w:hAnsi="Calibri" w:cs="Calibri"/>
+                <w:color w:val="000000"/>
+                <w:lang w:eastAsia="ru-RU"/>
+              </w:rPr>
+            </w:pPr>
+            <w:r>
+              <w:rPr>
+                <w:rFonts w:ascii="Calibri" w:eastAsia="Times New Roman" w:hAnsi="Calibri" w:cs="Calibri"/>
+                <w:color w:val="000000"/>
+                <w:lang w:eastAsia="ru-RU"/>
+              </w:rPr>
+              <w:t>Слайдер громкости</w:t>
+            </w:r>
+          </w:p>
+        </w:tc>
+        <w:tc>
+          <w:tcPr>
+            <w:tcW w:w="4252" w:type="dxa"/>
+            <w:tcBorders>
+              <w:top w:val="nil"/>
+              <w:left w:val="nil"/>
+              <w:bottom w:val="single" w:sz="4" w:space="0" w:color="3E80A3"/>
+              <w:right w:val="single" w:sz="4" w:space="0" w:color="3E80A3"/>
+            </w:tcBorders>
+            <w:shd w:val="clear" w:color="12233A" w:fill="FFFFFF"/>
+            <w:hideMark/>
+          </w:tcPr>
+          <w:p>
+            <w:pPr>
+              <w:spacing w:after="0" w:line="240" w:lineRule="auto"/>
+              <w:rPr>
+                <w:rFonts w:ascii="Calibri" w:eastAsia="Times New Roman" w:hAnsi="Calibri" w:cs="Calibri"/>
+                <w:color w:val="000000"/>
+                <w:lang w:eastAsia="ru-RU"/>
+              </w:rPr>
+            </w:pPr>
+            <w:r>
+              <w:rPr>
+                <w:rFonts w:ascii="Calibri" w:eastAsia="Times New Roman" w:hAnsi="Calibri" w:cs="Calibri"/>
+                <w:color w:val="000000"/>
+                <w:lang w:eastAsia="ru-RU"/>
+              </w:rPr>
+              <w:t>#00bfff</w:t>
+            </w:r>
+          </w:p>
+        </w:tc>
+        <w:tc>
+          <w:tcPr>
+            <w:tcW w:w="3832" w:type="dxa"/>
+            <w:tcBorders>
+              <w:top w:val="nil"/>
+              <w:left w:val="nil"/>
+              <w:bottom w:val="single" w:sz="4" w:space="0" w:color="3E80A3"/>
+              <w:right w:val="single" w:sz="4" w:space="0" w:color="3E80A3"/>
+            </w:tcBorders>
+            <w:shd w:val="clear" w:color="12233A" w:fill="FFFFFF"/>
+            <w:hideMark/>
+          </w:tcPr>
+          <w:p>
+            <w:pPr>
+              <w:spacing w:after="0" w:line="240" w:lineRule="auto"/>
+              <w:rPr>
+                <w:rFonts w:ascii="Calibri" w:eastAsia="Times New Roman" w:hAnsi="Calibri" w:cs="Calibri"/>
+                <w:color w:val="000000"/>
+                <w:lang w:eastAsia="ru-RU"/>
+              </w:rPr>
+            </w:pPr>
+            <w:r>
+              <w:rPr>
+                <w:rFonts w:ascii="Calibri" w:eastAsia="Times New Roman" w:hAnsi="Calibri" w:cs="Calibri"/>
+                <w:color w:val="000000"/>
+                <w:lang w:eastAsia="ru-RU"/>
+              </w:rPr>
+              <w:t>Кнопка и заливка слайдера громкости</w:t>
+            </w:r>
+          </w:p>
+        </w:tc>
+      </w:tr>
+      <w:tr>
+        <w:trPr>
+          <w:trHeight w:val="600"/>
+        </w:trPr>
+        <w:tc>
+          <w:tcPr>
+            <w:tcW w:w="2689" w:type="dxa"/>
+            <w:tcBorders>
+              <w:top w:val="nil"/>
+              <w:left w:val="single" w:sz="4" w:space="0" w:color="3E80A3"/>
+              <w:bottom w:val="single" w:sz="4" w:space="0" w:color="3E80A3"/>
+              <w:right w:val="single" w:sz="4" w:space="0" w:color="3E80A3"/>
+            </w:tcBorders>
+            <w:shd w:val="clear" w:color="0A1A2E" w:fill="FFFFFF"/>
+            <w:hideMark/>
+          </w:tcPr>
+          <w:p>
+            <w:pPr>
+              <w:spacing w:after="0" w:line="240" w:lineRule="auto"/>
+              <w:rPr>
+                <w:rFonts w:ascii="Calibri" w:eastAsia="Times New Roman" w:hAnsi="Calibri" w:cs="Calibri"/>
+                <w:color w:val="000000"/>
+                <w:lang w:eastAsia="ru-RU"/>
+              </w:rPr>
+            </w:pPr>
+            <w:proofErr w:type="spellStart"/>
+            <w:r>
+              <w:rPr>
+                <w:rFonts w:ascii="Calibri" w:eastAsia="Times New Roman" w:hAnsi="Calibri" w:cs="Calibri"/>
+                <w:color w:val="000000"/>
+                <w:lang w:eastAsia="ru-RU"/>
+              </w:rPr>
+              <w:t>Скроллбары</w:t>
+            </w:r>
+            <w:proofErr w:type="spellEnd"/>
+          </w:p>
+        </w:tc>
+        <w:tc>
+          <w:tcPr>
+            <w:tcW w:w="4252" w:type="dxa"/>
+            <w:tcBorders>
+              <w:top w:val="nil"/>
+              <w:left w:val="nil"/>
+              <w:bottom w:val="single" w:sz="4" w:space="0" w:color="3E80A3"/>
+              <w:right w:val="single" w:sz="4" w:space="0" w:color="3E80A3"/>
+            </w:tcBorders>
+            <w:shd w:val="clear" w:color="0A1A2E" w:fill="FFFFFF"/>
+            <w:hideMark/>
+          </w:tcPr>
+          <w:p>
+            <w:pPr>
+              <w:spacing w:after="0" w:line="240" w:lineRule="auto"/>
+              <w:rPr>
+                <w:rFonts w:ascii="Calibri" w:eastAsia="Times New Roman" w:hAnsi="Calibri" w:cs="Calibri"/>
+                <w:color w:val="000000"/>
+                <w:lang w:eastAsia="ru-RU"/>
+              </w:rPr>
+            </w:pPr>
+            <w:r>
+              <w:rPr>
+                <w:rFonts w:ascii="Calibri" w:eastAsia="Times New Roman" w:hAnsi="Calibri" w:cs="Calibri"/>
+                <w:color w:val="000000"/>
+                <w:lang w:eastAsia="ru-RU"/>
+              </w:rPr>
+              <w:t>#3e80a3 (обычный) / #00bfff (</w:t>
+            </w:r>
+            <w:proofErr w:type="spellStart"/>
+            <w:r>
+              <w:rPr>
+                <w:rFonts w:ascii="Calibri" w:eastAsia="Times New Roman" w:hAnsi="Calibri" w:cs="Calibri"/>
+                <w:color w:val="000000"/>
+                <w:lang w:eastAsia="ru-RU"/>
+              </w:rPr>
+              <w:t>hover</w:t>
+            </w:r>
+            <w:proofErr w:type="spellEnd"/>
+            <w:r>
+              <w:rPr>
+                <w:rFonts w:ascii="Calibri" w:eastAsia="Times New Roman" w:hAnsi="Calibri" w:cs="Calibri"/>
+                <w:color w:val="000000"/>
+                <w:lang w:eastAsia="ru-RU"/>
+              </w:rPr>
+              <w:t>)</w:t>
+            </w:r>
+          </w:p>
+        </w:tc>
+        <w:tc>
+          <w:tcPr>
+            <w:tcW w:w="3832" w:type="dxa"/>
+            <w:tcBorders>
+              <w:top w:val="nil"/>
+              <w:left w:val="nil"/>
+              <w:bottom w:val="single" w:sz="4" w:space="0" w:color="3E80A3"/>
+              <w:right w:val="single" w:sz="4" w:space="0" w:color="3E80A3"/>
+            </w:tcBorders>
+            <w:shd w:val="clear" w:color="0A1A2E" w:fill="FFFFFF"/>
+            <w:hideMark/>
+          </w:tcPr>
+          <w:p>
+            <w:pPr>
+              <w:spacing w:after="0" w:line="240" w:lineRule="auto"/>
+              <w:rPr>
+                <w:rFonts w:ascii="Calibri" w:eastAsia="Times New Roman" w:hAnsi="Calibri" w:cs="Calibri"/>
+                <w:color w:val="000000"/>
+                <w:lang w:eastAsia="ru-RU"/>
+              </w:rPr>
+            </w:pPr>
+            <w:r>
+              <w:rPr>
+                <w:rFonts w:ascii="Calibri" w:eastAsia="Times New Roman" w:hAnsi="Calibri" w:cs="Calibri"/>
+                <w:color w:val="000000"/>
+                <w:lang w:eastAsia="ru-RU"/>
+              </w:rPr>
+              <w:t>Полосы прокрутки в списках плейлистов и треков</w:t>
+            </w:r>
+          </w:p>
+        </w:tc>
+      </w:tr>
+      <w:tr>
+        <w:trPr>
+          <w:trHeight w:val="300"/>
+        </w:trPr>
+        <w:tc>
+          <w:tcPr>
+            <w:tcW w:w="2689" w:type="dxa"/>
+            <w:tcBorders>
+              <w:top w:val="nil"/>
+              <w:left w:val="single" w:sz="4" w:space="0" w:color="3E80A3"/>
+              <w:bottom w:val="single" w:sz="4" w:space="0" w:color="3E80A3"/>
+              <w:right w:val="single" w:sz="4" w:space="0" w:color="3E80A3"/>
+            </w:tcBorders>
+            <w:shd w:val="clear" w:color="12233A" w:fill="FFFFFF"/>
+            <w:hideMark/>
+          </w:tcPr>
+          <w:p>
+            <w:pPr>
+              <w:spacing w:after="0" w:line="240" w:lineRule="auto"/>
+              <w:rPr>
+                <w:rFonts w:ascii="Calibri" w:eastAsia="Times New Roman" w:hAnsi="Calibri" w:cs="Calibri"/>
+                <w:color w:val="000000"/>
+                <w:lang w:eastAsia="ru-RU"/>
+              </w:rPr>
+            </w:pPr>
+            <w:proofErr w:type="spellStart"/>
+            <w:r>
+              <w:rPr>
+                <w:rFonts w:ascii="Calibri" w:eastAsia="Times New Roman" w:hAnsi="Calibri" w:cs="Calibri"/>
+                <w:color w:val="000000"/>
+                <w:lang w:eastAsia="ru-RU"/>
+              </w:rPr>
+              <w:t>Попапы</w:t>
+            </w:r>
+            <w:proofErr w:type="spellEnd"/>
+            <w:r>
+              <w:rPr>
+                <w:rFonts w:ascii="Calibri" w:eastAsia="Times New Roman" w:hAnsi="Calibri" w:cs="Calibri"/>
+                <w:color w:val="000000"/>
+                <w:lang w:eastAsia="ru-RU"/>
+              </w:rPr>
+              <w:t xml:space="preserve"> (Источники / Откат)</w:t>
+            </w:r>
+          </w:p>
+        </w:tc>
+        <w:tc>
+          <w:tcPr>
+            <w:tcW w:w="4252" w:type="dxa"/>
+            <w:tcBorders>
+              <w:top w:val="nil"/>
+              <w:left w:val="nil"/>
+              <w:bottom w:val="single" w:sz="4" w:space="0" w:color="3E80A3"/>
+              <w:right w:val="single" w:sz="4" w:space="0" w:color="3E80A3"/>
+            </w:tcBorders>
+            <w:shd w:val="clear" w:color="12233A" w:fill="FFFFFF"/>
+            <w:hideMark/>
+          </w:tcPr>
+          <w:p>
+            <w:pPr>
+              <w:spacing w:after="0" w:line="240" w:lineRule="auto"/>
+              <w:rPr>
+                <w:rFonts w:ascii="Calibri" w:eastAsia="Times New Roman" w:hAnsi="Calibri" w:cs="Calibri"/>
+                <w:color w:val="000000"/>
+                <w:lang w:eastAsia="ru-RU"/>
+              </w:rPr>
+            </w:pPr>
+            <w:r>
+              <w:rPr>
+                <w:rFonts w:ascii="Calibri" w:eastAsia="Times New Roman" w:hAnsi="Calibri" w:cs="Calibri"/>
+                <w:color w:val="000000"/>
+                <w:lang w:eastAsia="ru-RU"/>
+              </w:rPr>
+              <w:t>#0a1a2e (BG_PANEL)</w:t>
+            </w:r>
+          </w:p>
+        </w:tc>
+        <w:tc>
+          <w:tcPr>
+            <w:tcW w:w="3832" w:type="dxa"/>
+            <w:tcBorders>
+              <w:top w:val="nil"/>
+              <w:left w:val="nil"/>
+              <w:bottom w:val="single" w:sz="4" w:space="0" w:color="3E80A3"/>
+              <w:right w:val="single" w:sz="4" w:space="0" w:color="3E80A3"/>
+            </w:tcBorders>
+            <w:shd w:val="clear" w:color="12233A" w:fill="FFFFFF"/>
+            <w:hideMark/>
+          </w:tcPr>
+          <w:p>
+            <w:pPr>
+              <w:spacing w:after="0" w:line="240" w:lineRule="auto"/>
+              <w:rPr>
+                <w:rFonts w:ascii="Calibri" w:eastAsia="Times New Roman" w:hAnsi="Calibri" w:cs="Calibri"/>
+                <w:color w:val="000000"/>
+                <w:lang w:eastAsia="ru-RU"/>
+              </w:rPr>
+            </w:pPr>
+            <w:r>
+              <w:rPr>
+                <w:rFonts w:ascii="Calibri" w:eastAsia="Times New Roman" w:hAnsi="Calibri" w:cs="Calibri"/>
+                <w:color w:val="000000"/>
+                <w:lang w:eastAsia="ru-RU"/>
+              </w:rPr>
+              <w:t>Фон всплывающих меню</w:t>
+            </w:r>
+          </w:p>
+        </w:tc>
+      </w:tr>
+      <w:tr>
+        <w:trPr>
+          <w:trHeight w:val="600"/>
+        </w:trPr>
+        <w:tc>
+          <w:tcPr>
+            <w:tcW w:w="2689" w:type="dxa"/>
+            <w:tcBorders>
+              <w:top w:val="nil"/>
+              <w:left w:val="single" w:sz="4" w:space="0" w:color="3E80A3"/>
+              <w:bottom w:val="single" w:sz="4" w:space="0" w:color="3E80A3"/>
+              <w:right w:val="single" w:sz="4" w:space="0" w:color="3E80A3"/>
+            </w:tcBorders>
+            <w:shd w:val="clear" w:color="0A1A2E" w:fill="FFFFFF"/>
+            <w:hideMark/>
+          </w:tcPr>
+          <w:p>
+            <w:pPr>
+              <w:spacing w:after="0" w:line="240" w:lineRule="auto"/>
+              <w:rPr>
+                <w:rFonts w:ascii="Calibri" w:eastAsia="Times New Roman" w:hAnsi="Calibri" w:cs="Calibri"/>
+                <w:color w:val="000000"/>
+                <w:lang w:eastAsia="ru-RU"/>
+              </w:rPr>
+            </w:pPr>
+            <w:r>
+              <w:rPr>
+                <w:rFonts w:ascii="Calibri" w:eastAsia="Times New Roman" w:hAnsi="Calibri" w:cs="Calibri"/>
+                <w:color w:val="000000"/>
+                <w:lang w:eastAsia="ru-RU"/>
+              </w:rPr>
+              <w:t>Основной текст</w:t>
+            </w:r>
+          </w:p>
+        </w:tc>
+        <w:tc>
+          <w:tcPr>
+            <w:tcW w:w="4252" w:type="dxa"/>
+            <w:tcBorders>
+              <w:top w:val="nil"/>
+              <w:left w:val="nil"/>
+              <w:bottom w:val="single" w:sz="4" w:space="0" w:color="3E80A3"/>
+              <w:right w:val="single" w:sz="4" w:space="0" w:color="3E80A3"/>
+            </w:tcBorders>
+            <w:shd w:val="clear" w:color="0A1A2E" w:fill="FFFFFF"/>
+            <w:hideMark/>
+          </w:tcPr>
+          <w:p>
+            <w:pPr>
+              <w:spacing w:after="0" w:line="240" w:lineRule="auto"/>
+              <w:rPr>
+                <w:rFonts w:ascii="Calibri" w:eastAsia="Times New Roman" w:hAnsi="Calibri" w:cs="Calibri"/>
+                <w:color w:val="000000"/>
+                <w:lang w:eastAsia="ru-RU"/>
+              </w:rPr>
+            </w:pPr>
+            <w:r>
+              <w:rPr>
+                <w:rFonts w:ascii="Calibri" w:eastAsia="Times New Roman" w:hAnsi="Calibri" w:cs="Calibri"/>
+                <w:color w:val="000000"/>
+                <w:lang w:eastAsia="ru-RU"/>
+              </w:rPr>
+              <w:t>#e8f4ff (TEXT_PRIMARY)</w:t>
+            </w:r>
+          </w:p>
+        </w:tc>
+        <w:tc>
+          <w:tcPr>
+            <w:tcW w:w="3832" w:type="dxa"/>
+            <w:tcBorders>
+              <w:top w:val="nil"/>
+              <w:left w:val="nil"/>
+              <w:bottom w:val="single" w:sz="4" w:space="0" w:color="3E80A3"/>
+              <w:right w:val="single" w:sz="4" w:space="0" w:color="3E80A3"/>
+            </w:tcBorders>
+            <w:shd w:val="clear" w:color="0A1A2E" w:fill="FFFFFF"/>
+            <w:hideMark/>
+          </w:tcPr>
+          <w:p>
+            <w:pPr>
+              <w:spacing w:after="0" w:line="240" w:lineRule="auto"/>
+              <w:rPr>
+                <w:rFonts w:ascii="Calibri" w:eastAsia="Times New Roman" w:hAnsi="Calibri" w:cs="Calibri"/>
+                <w:color w:val="000000"/>
+                <w:lang w:eastAsia="ru-RU"/>
+              </w:rPr>
+            </w:pPr>
+            <w:r>
+              <w:rPr>
+                <w:rFonts w:ascii="Calibri" w:eastAsia="Times New Roman" w:hAnsi="Calibri" w:cs="Calibri"/>
+                <w:color w:val="000000"/>
+                <w:lang w:eastAsia="ru-RU"/>
+              </w:rPr>
+              <w:t>Названия плейлистов, треков, крупные заголовки</w:t>
+            </w:r>
+          </w:p>
+        </w:tc>
+      </w:tr>
+      <w:tr>
+        <w:trPr>
+          <w:trHeight w:val="300"/>
+        </w:trPr>
+        <w:tc>
+          <w:tcPr>
+            <w:tcW w:w="2689" w:type="dxa"/>
+            <w:tcBorders>
+              <w:top w:val="nil"/>
+              <w:left w:val="single" w:sz="4" w:space="0" w:color="3E80A3"/>
+              <w:bottom w:val="single" w:sz="4" w:space="0" w:color="3E80A3"/>
+              <w:right w:val="single" w:sz="4" w:space="0" w:color="3E80A3"/>
+            </w:tcBorders>
+            <w:shd w:val="clear" w:color="12233A" w:fill="FFFFFF"/>
+            <w:hideMark/>
+          </w:tcPr>
+          <w:p>
+            <w:pPr>
+              <w:spacing w:after="0" w:line="240" w:lineRule="auto"/>
+              <w:rPr>
+                <w:rFonts w:ascii="Calibri" w:eastAsia="Times New Roman" w:hAnsi="Calibri" w:cs="Calibri"/>
+                <w:color w:val="000000"/>
+                <w:lang w:eastAsia="ru-RU"/>
+              </w:rPr>
+            </w:pPr>
+            <w:r>
+              <w:rPr>
+                <w:rFonts w:ascii="Calibri" w:eastAsia="Times New Roman" w:hAnsi="Calibri" w:cs="Calibri"/>
+                <w:color w:val="000000"/>
+                <w:lang w:eastAsia="ru-RU"/>
+              </w:rPr>
+              <w:t>Вторичный текст</w:t>
+            </w:r>
+          </w:p>
+        </w:tc>
+        <w:tc>
+          <w:tcPr>
+            <w:tcW w:w="4252" w:type="dxa"/>
+            <w:tcBorders>
+              <w:top w:val="nil"/>
+              <w:left w:val="nil"/>
+              <w:bottom w:val="single" w:sz="4" w:space="0" w:color="3E80A3"/>
+              <w:right w:val="single" w:sz="4" w:space="0" w:color="3E80A3"/>
+            </w:tcBorders>
+            <w:shd w:val="clear" w:color="12233A" w:fill="FFFFFF"/>
+            <w:hideMark/>
+          </w:tcPr>
+          <w:p>
+            <w:pPr>
+              <w:spacing w:after="0" w:line="240" w:lineRule="auto"/>
+              <w:rPr>
+                <w:rFonts w:ascii="Calibri" w:eastAsia="Times New Roman" w:hAnsi="Calibri" w:cs="Calibri"/>
+                <w:color w:val="000000"/>
+                <w:lang w:eastAsia="ru-RU"/>
+              </w:rPr>
+            </w:pPr>
+            <w:r>
+              <w:rPr>
+                <w:rFonts w:ascii="Calibri" w:eastAsia="Times New Roman" w:hAnsi="Calibri" w:cs="Calibri"/>
+                <w:color w:val="000000"/>
+                <w:lang w:eastAsia="ru-RU"/>
+              </w:rPr>
+              <w:t>#a8d4f0 (TEXT_SECONDARY)</w:t>
+            </w:r>
+          </w:p>
+        </w:tc>
+        <w:tc>
+          <w:tcPr>
+            <w:tcW w:w="3832" w:type="dxa"/>
+            <w:tcBorders>
+              <w:top w:val="nil"/>
+              <w:left w:val="nil"/>
+              <w:bottom w:val="single" w:sz="4" w:space="0" w:color="3E80A3"/>
+              <w:right w:val="single" w:sz="4" w:space="0" w:color="3E80A3"/>
+            </w:tcBorders>
+            <w:shd w:val="clear" w:color="12233A" w:fill="FFFFFF"/>
+            <w:hideMark/>
+          </w:tcPr>
+          <w:p>
+            <w:pPr>
+              <w:spacing w:after="0" w:line="240" w:lineRule="auto"/>
+              <w:rPr>
+                <w:rFonts w:ascii="Calibri" w:eastAsia="Times New Roman" w:hAnsi="Calibri" w:cs="Calibri"/>
+                <w:color w:val="000000"/>
+                <w:lang w:eastAsia="ru-RU"/>
+              </w:rPr>
+            </w:pPr>
+            <w:r>
+              <w:rPr>
+                <w:rFonts w:ascii="Calibri" w:eastAsia="Times New Roman" w:hAnsi="Calibri" w:cs="Calibri"/>
+                <w:color w:val="000000"/>
+                <w:lang w:eastAsia="ru-RU"/>
+              </w:rPr>
+              <w:t>Заголовок ПЛЕЙЛИСТЫ, подписи</w:t>
+            </w:r>
+          </w:p>
+        </w:tc>
+      </w:tr>
+      <w:tr>
+        <w:trPr>
+          <w:trHeight w:val="600"/>
+        </w:trPr>
+        <w:tc>
+          <w:tcPr>
+            <w:tcW w:w="2689" w:type="dxa"/>
+            <w:tcBorders>
+              <w:top w:val="nil"/>
+              <w:left w:val="single" w:sz="4" w:space="0" w:color="3E80A3"/>
+              <w:bottom w:val="single" w:sz="4" w:space="0" w:color="3E80A3"/>
+              <w:right w:val="single" w:sz="4" w:space="0" w:color="3E80A3"/>
+            </w:tcBorders>
+            <w:shd w:val="clear" w:color="0A1A2E" w:fill="FFFFFF"/>
+            <w:hideMark/>
+          </w:tcPr>
+          <w:p>
+            <w:pPr>
+              <w:spacing w:after="0" w:line="240" w:lineRule="auto"/>
+              <w:rPr>
+                <w:rFonts w:ascii="Calibri" w:eastAsia="Times New Roman" w:hAnsi="Calibri" w:cs="Calibri"/>
+                <w:color w:val="000000"/>
+                <w:lang w:eastAsia="ru-RU"/>
+              </w:rPr>
+            </w:pPr>
+            <w:r>
+              <w:rPr>
+                <w:rFonts w:ascii="Calibri" w:eastAsia="Times New Roman" w:hAnsi="Calibri" w:cs="Calibri"/>
+                <w:color w:val="000000"/>
+                <w:lang w:eastAsia="ru-RU"/>
+              </w:rPr>
+              <w:t>Приглушённый текст</w:t>
+            </w:r>
+          </w:p>
+        </w:tc>
+        <w:tc>
+          <w:tcPr>
+            <w:tcW w:w="4252" w:type="dxa"/>
+            <w:tcBorders>
+              <w:top w:val="nil"/>
+              <w:left w:val="nil"/>
+              <w:bottom w:val="single" w:sz="4" w:space="0" w:color="3E80A3"/>
+              <w:right w:val="single" w:sz="4" w:space="0" w:color="3E80A3"/>
+            </w:tcBorders>
+            <w:shd w:val="clear" w:color="0A1A2E" w:fill="FFFFFF"/>
+            <w:hideMark/>
+          </w:tcPr>
+          <w:p>
+            <w:pPr>
+              <w:spacing w:after="0" w:line="240" w:lineRule="auto"/>
+              <w:rPr>
+                <w:rFonts w:ascii="Calibri" w:eastAsia="Times New Roman" w:hAnsi="Calibri" w:cs="Calibri"/>
+                <w:color w:val="000000"/>
+                <w:lang w:eastAsia="ru-RU"/>
+              </w:rPr>
+            </w:pPr>
+            <w:r>
+              <w:rPr>
+                <w:rFonts w:ascii="Calibri" w:eastAsia="Times New Roman" w:hAnsi="Calibri" w:cs="Calibri"/>
+                <w:color w:val="000000"/>
+                <w:lang w:eastAsia="ru-RU"/>
+              </w:rPr>
+              <w:t>#5c7a9a (TEXT_MUTED)</w:t>
+            </w:r>
+          </w:p>
+        </w:tc>
+        <w:tc>
+          <w:tcPr>
+            <w:tcW w:w="3832" w:type="dxa"/>
+            <w:tcBorders>
+              <w:top w:val="nil"/>
+              <w:left w:val="nil"/>
+              <w:bottom w:val="single" w:sz="4" w:space="0" w:color="3E80A3"/>
+              <w:right w:val="single" w:sz="4" w:space="0" w:color="3E80A3"/>
+            </w:tcBorders>
+            <w:shd w:val="clear" w:color="0A1A2E" w:fill="FFFFFF"/>
+            <w:hideMark/>
+          </w:tcPr>
+          <w:p>
+            <w:pPr>
+              <w:spacing w:after="0" w:line="240" w:lineRule="auto"/>
+              <w:rPr>
+                <w:rFonts w:ascii="Calibri" w:eastAsia="Times New Roman" w:hAnsi="Calibri" w:cs="Calibri"/>
+                <w:color w:val="000000"/>
+                <w:lang w:eastAsia="ru-RU"/>
+              </w:rPr>
+            </w:pPr>
+            <w:r>
+              <w:rPr>
+                <w:rFonts w:ascii="Calibri" w:eastAsia="Times New Roman" w:hAnsi="Calibri" w:cs="Calibri"/>
+                <w:color w:val="000000"/>
+                <w:lang w:eastAsia="ru-RU"/>
+              </w:rPr>
+              <w:t xml:space="preserve">Номера строк, время, версия, </w:t>
+            </w:r>
+            <w:proofErr w:type="spellStart"/>
+            <w:r>
+              <w:rPr>
+                <w:rFonts w:ascii="Calibri" w:eastAsia="Times New Roman" w:hAnsi="Calibri" w:cs="Calibri"/>
+                <w:color w:val="000000"/>
+                <w:lang w:eastAsia="ru-RU"/>
+              </w:rPr>
+              <w:t>плейсхолдеры</w:t>
+            </w:r>
+            <w:proofErr w:type="spellEnd"/>
+          </w:p>
+        </w:tc>
+      </w:tr>
+      <w:tr>
+        <w:trPr>
+          <w:trHeight w:val="600"/>
+        </w:trPr>
+        <w:tc>
+          <w:tcPr>
+            <w:tcW w:w="2689" w:type="dxa"/>
+            <w:tcBorders>
+              <w:top w:val="nil"/>
+              <w:left w:val="single" w:sz="4" w:space="0" w:color="3E80A3"/>
+              <w:bottom w:val="single" w:sz="4" w:space="0" w:color="3E80A3"/>
+              <w:right w:val="single" w:sz="4" w:space="0" w:color="3E80A3"/>
+            </w:tcBorders>
+            <w:shd w:val="clear" w:color="12233A" w:fill="FFFFFF"/>
+            <w:hideMark/>
+          </w:tcPr>
+          <w:p>
+            <w:pPr>
+              <w:spacing w:after="0" w:line="240" w:lineRule="auto"/>
+              <w:rPr>
+                <w:rFonts w:ascii="Calibri" w:eastAsia="Times New Roman" w:hAnsi="Calibri" w:cs="Calibri"/>
+                <w:color w:val="000000"/>
+                <w:lang w:eastAsia="ru-RU"/>
+              </w:rPr>
+            </w:pPr>
+            <w:r>
+              <w:rPr>
+                <w:rFonts w:ascii="Calibri" w:eastAsia="Times New Roman" w:hAnsi="Calibri" w:cs="Calibri"/>
+                <w:color w:val="000000"/>
+                <w:lang w:eastAsia="ru-RU"/>
+              </w:rPr>
+              <w:t>Кнопки удаления (</w:t>
+            </w:r>
+            <w:proofErr w:type="spellStart"/>
+            <w:r>
+              <w:rPr>
+                <w:rFonts w:ascii="Calibri" w:eastAsia="Times New Roman" w:hAnsi="Calibri" w:cs="Calibri"/>
+                <w:color w:val="000000"/>
+                <w:lang w:eastAsia="ru-RU"/>
+              </w:rPr>
+              <w:t>hover</w:t>
+            </w:r>
+            <w:proofErr w:type="spellEnd"/>
+            <w:r>
+              <w:rPr>
+                <w:rFonts w:ascii="Calibri" w:eastAsia="Times New Roman" w:hAnsi="Calibri" w:cs="Calibri"/>
+                <w:color w:val="000000"/>
+                <w:lang w:eastAsia="ru-RU"/>
+              </w:rPr>
+              <w:t>)</w:t>
+            </w:r>
+          </w:p>
+        </w:tc>
+        <w:tc>
+          <w:tcPr>
+            <w:tcW w:w="4252" w:type="dxa"/>
+            <w:tcBorders>
+              <w:top w:val="nil"/>
+              <w:left w:val="nil"/>
+              <w:bottom w:val="single" w:sz="4" w:space="0" w:color="3E80A3"/>
+              <w:right w:val="single" w:sz="4" w:space="0" w:color="3E80A3"/>
+            </w:tcBorders>
+            <w:shd w:val="clear" w:color="12233A" w:fill="FFFFFF"/>
+            <w:hideMark/>
+          </w:tcPr>
+          <w:p>
+            <w:pPr>
+              <w:spacing w:after="0" w:line="240" w:lineRule="auto"/>
+              <w:rPr>
+                <w:rFonts w:ascii="Calibri" w:eastAsia="Times New Roman" w:hAnsi="Calibri" w:cs="Calibri"/>
+                <w:color w:val="000000"/>
+                <w:lang w:eastAsia="ru-RU"/>
+              </w:rPr>
+            </w:pPr>
+            <w:r>
+              <w:rPr>
+                <w:rFonts w:ascii="Calibri" w:eastAsia="Times New Roman" w:hAnsi="Calibri" w:cs="Calibri"/>
+                <w:color w:val="000000"/>
+                <w:lang w:eastAsia="ru-RU"/>
+              </w:rPr>
+              <w:t>#3A2A2A / #4A2A2A</w:t>
+            </w:r>
+          </w:p>
+        </w:tc>
+        <w:tc>
+          <w:tcPr>
+            <w:tcW w:w="3832" w:type="dxa"/>
+            <w:tcBorders>
+              <w:top w:val="nil"/>
+              <w:left w:val="nil"/>
+              <w:bottom w:val="single" w:sz="4" w:space="0" w:color="3E80A3"/>
+              <w:right w:val="single" w:sz="4" w:space="0" w:color="3E80A3"/>
+            </w:tcBorders>
+            <w:shd w:val="clear" w:color="12233A" w:fill="FFFFFF"/>
+            <w:hideMark/>
+          </w:tcPr>
+          <w:p>
+            <w:pPr>
+              <w:spacing w:after="0" w:line="240" w:lineRule="auto"/>
+              <w:rPr>
+                <w:rFonts w:ascii="Calibri" w:eastAsia="Times New Roman" w:hAnsi="Calibri" w:cs="Calibri"/>
+                <w:color w:val="000000"/>
+                <w:lang w:eastAsia="ru-RU"/>
+              </w:rPr>
+            </w:pPr>
+            <w:proofErr w:type="spellStart"/>
+            <w:r>
+              <w:rPr>
+                <w:rFonts w:ascii="Calibri" w:eastAsia="Times New Roman" w:hAnsi="Calibri" w:cs="Calibri"/>
+                <w:color w:val="000000"/>
+                <w:lang w:eastAsia="ru-RU"/>
+              </w:rPr>
+              <w:t>Hover</w:t>
+            </w:r>
+            <w:proofErr w:type="spellEnd"/>
+            <w:r>
+              <w:rPr>
+                <w:rFonts w:ascii="Calibri" w:eastAsia="Times New Roman" w:hAnsi="Calibri" w:cs="Calibri"/>
+                <w:color w:val="000000"/>
+                <w:lang w:eastAsia="ru-RU"/>
+              </w:rPr>
+              <w:t xml:space="preserve"> для кнопок X (удаление трека) </w:t>
+            </w:r>
+            <w:proofErr w:type="gramStart"/>
+            <w:r>
+              <w:rPr>
+                <w:rFonts w:ascii="Calibri" w:eastAsia="Times New Roman" w:hAnsi="Calibri" w:cs="Calibri"/>
+                <w:color w:val="000000"/>
+                <w:lang w:eastAsia="ru-RU"/>
+              </w:rPr>
+              <w:t>и Удалить</w:t>
+            </w:r>
+            <w:proofErr w:type="gramEnd"/>
+            <w:r>
+              <w:rPr>
+                <w:rFonts w:ascii="Calibri" w:eastAsia="Times New Roman" w:hAnsi="Calibri" w:cs="Calibri"/>
+                <w:color w:val="000000"/>
+                <w:lang w:eastAsia="ru-RU"/>
+              </w:rPr>
+              <w:t xml:space="preserve"> все папки</w:t>
+            </w:r>
+          </w:p>
+        </w:tc>
+      </w:tr>
+    </w:tbl>
+    <w:p>
+      <w:pPr>
+        <w:pStyle w:val="a3"/>
+        <w:ind w:left="0"/>
+      </w:pPr>
     </w:p>
     <w:sectPr>
       <w:pgSz w:w="11906" w:h="16838"/>
@@ -1687,8 +4042,8 @@
 </file>
 
 <file path=word/numbering.xml><?xml version="1.0" encoding="utf-8"?>
-<w:numbering xmlns:wpc="http://schemas.microsoft.com/office/word/2010/wordprocessingCanvas" xmlns:mc="http://schemas.openxmlformats.org/markup-compatibility/2006" xmlns:o="urn:schemas-microsoft-com:office:office" xmlns:r="http://schemas.openxmlformats.org/officeDocument/2006/relationships" xmlns:m="http://schemas.openxmlformats.org/officeDocument/2006/math" xmlns:v="urn:schemas-microsoft-com:vml" xmlns:wp14="http://schemas.microsoft.com/office/word/2010/wordprocessingDrawing" xmlns:wp="http://schemas.openxmlformats.org/drawingml/2006/wordprocessingDrawing" xmlns:w10="urn:schemas-microsoft-com:office:word" xmlns:w="http://schemas.openxmlformats.org/wordprocessingml/2006/main" xmlns:w14="http://schemas.microsoft.com/office/word/2010/wordml" xmlns:w15="http://schemas.microsoft.com/office/word/2012/wordml" xmlns:wpg="http://schemas.microsoft.com/office/word/2010/wordprocessingGroup" xmlns:wpi="http://schemas.microsoft.com/office/word/2010/wordprocessingInk" xmlns:wne="http://schemas.microsoft.com/office/word/2006/wordml" xmlns:wps="http://schemas.microsoft.com/office/word/2010/wordprocessingShape" mc:Ignorable="w14 w15 wp14">
-  <w:abstractNum w:abstractNumId="0">
+<w:numbering xmlns:wpc="http://schemas.microsoft.com/office/word/2010/wordprocessingCanvas" xmlns:cx="http://schemas.microsoft.com/office/drawing/2014/chartex" xmlns:cx1="http://schemas.microsoft.com/office/drawing/2015/9/8/chartex" xmlns:cx2="http://schemas.microsoft.com/office/drawing/2015/10/21/chartex" xmlns:cx3="http://schemas.microsoft.com/office/drawing/2016/5/9/chartex" xmlns:cx4="http://schemas.microsoft.com/office/drawing/2016/5/10/chartex" xmlns:cx5="http://schemas.microsoft.com/office/drawing/2016/5/11/chartex" xmlns:cx6="http://schemas.microsoft.com/office/drawing/2016/5/12/chartex" xmlns:cx7="http://schemas.microsoft.com/office/drawing/2016/5/13/chartex" xmlns:cx8="http://schemas.microsoft.com/office/drawing/2016/5/14/chartex" xmlns:mc="http://schemas.openxmlformats.org/markup-compatibility/2006" xmlns:aink="http://schemas.microsoft.com/office/drawing/2016/ink" xmlns:am3d="http://schemas.microsoft.com/office/drawing/2017/model3d" xmlns:o="urn:schemas-microsoft-com:office:office" xmlns:oel="http://schemas.microsoft.com/office/2019/extlst" xmlns:r="http://schemas.openxmlformats.org/officeDocument/2006/relationships" xmlns:m="http://schemas.openxmlformats.org/officeDocument/2006/math" xmlns:v="urn:schemas-microsoft-com:vml" xmlns:wp14="http://schemas.microsoft.com/office/word/2010/wordprocessingDrawing" xmlns:wp="http://schemas.openxmlformats.org/drawingml/2006/wordprocessingDrawing" xmlns:w10="urn:schemas-microsoft-com:office:word" xmlns:w="http://schemas.openxmlformats.org/wordprocessingml/2006/main" xmlns:w14="http://schemas.microsoft.com/office/word/2010/wordml" xmlns:w15="http://schemas.microsoft.com/office/word/2012/wordml" xmlns:w16cex="http://schemas.microsoft.com/office/word/2018/wordml/cex" xmlns:w16cid="http://schemas.microsoft.com/office/word/2016/wordml/cid" xmlns:w16="http://schemas.microsoft.com/office/word/2018/wordml" xmlns:w16sdtdh="http://schemas.microsoft.com/office/word/2020/wordml/sdtdatahash" xmlns:w16se="http://schemas.microsoft.com/office/word/2015/wordml/symex" xmlns:wpg="http://schemas.microsoft.com/office/word/2010/wordprocessingGroup" xmlns:wpi="http://schemas.microsoft.com/office/word/2010/wordprocessingInk" xmlns:wne="http://schemas.microsoft.com/office/word/2006/wordml" xmlns:wps="http://schemas.microsoft.com/office/word/2010/wordprocessingShape" mc:Ignorable="w14 w15 w16se w16cid w16 w16cex w16sdtdh wp14">
+  <w:abstractNum w:abstractNumId="0" w15:restartNumberingAfterBreak="0">
     <w:nsid w:val="2532384E"/>
     <w:multiLevelType w:val="hybridMultilevel"/>
     <w:tmpl w:val="3538F60E"/>
@@ -1777,14 +4132,14 @@
       </w:pPr>
     </w:lvl>
   </w:abstractNum>
-  <w:num w:numId="1">
+  <w:num w:numId="1" w16cid:durableId="345598064">
     <w:abstractNumId w:val="0"/>
   </w:num>
 </w:numbering>
 </file>
 
 <file path=word/styles.xml><?xml version="1.0" encoding="utf-8"?>
-<w:styles xmlns:mc="http://schemas.openxmlformats.org/markup-compatibility/2006" xmlns:r="http://schemas.openxmlformats.org/officeDocument/2006/relationships" xmlns:w="http://schemas.openxmlformats.org/wordprocessingml/2006/main" xmlns:w14="http://schemas.microsoft.com/office/word/2010/wordml" xmlns:w15="http://schemas.microsoft.com/office/word/2012/wordml" mc:Ignorable="w14 w15">
+<w:styles xmlns:mc="http://schemas.openxmlformats.org/markup-compatibility/2006" xmlns:r="http://schemas.openxmlformats.org/officeDocument/2006/relationships" xmlns:w="http://schemas.openxmlformats.org/wordprocessingml/2006/main" xmlns:w14="http://schemas.microsoft.com/office/word/2010/wordml" xmlns:w15="http://schemas.microsoft.com/office/word/2012/wordml" xmlns:w16cex="http://schemas.microsoft.com/office/word/2018/wordml/cex" xmlns:w16cid="http://schemas.microsoft.com/office/word/2016/wordml/cid" xmlns:w16="http://schemas.microsoft.com/office/word/2018/wordml" xmlns:w16sdtdh="http://schemas.microsoft.com/office/word/2020/wordml/sdtdatahash" xmlns:w16se="http://schemas.microsoft.com/office/word/2015/wordml/symex" mc:Ignorable="w14 w15 w16se w16cid w16 w16cex w16sdtdh">
   <w:docDefaults>
     <w:rPrDefault>
       <w:rPr>
@@ -1800,7 +4155,7 @@
       </w:pPr>
     </w:pPrDefault>
   </w:docDefaults>
-  <w:latentStyles w:defLockedState="0" w:defUIPriority="99" w:defSemiHidden="0" w:defUnhideWhenUsed="0" w:defQFormat="0" w:count="371">
+  <w:latentStyles w:defLockedState="0" w:defUIPriority="99" w:defSemiHidden="0" w:defUnhideWhenUsed="0" w:defQFormat="0" w:count="376">
     <w:lsdException w:name="Normal" w:uiPriority="0" w:qFormat="1"/>
     <w:lsdException w:name="heading 1" w:uiPriority="9" w:qFormat="1"/>
     <w:lsdException w:name="heading 2" w:semiHidden="1" w:uiPriority="9" w:unhideWhenUsed="1" w:qFormat="1"/>
@@ -1906,7 +4261,6 @@
     <w:lsdException w:name="HTML Sample" w:semiHidden="1" w:unhideWhenUsed="1"/>
     <w:lsdException w:name="HTML Typewriter" w:semiHidden="1" w:unhideWhenUsed="1"/>
     <w:lsdException w:name="HTML Variable" w:semiHidden="1" w:unhideWhenUsed="1"/>
-    <w:lsdException w:name="Normal Table" w:semiHidden="1" w:unhideWhenUsed="1"/>
     <w:lsdException w:name="annotation subject" w:semiHidden="1" w:unhideWhenUsed="1"/>
     <w:lsdException w:name="No List" w:semiHidden="1" w:unhideWhenUsed="1"/>
     <w:lsdException w:name="Outline List 1" w:semiHidden="1" w:unhideWhenUsed="1"/>
@@ -1949,11 +4303,8 @@
     <w:lsdException w:name="Table Contemporary" w:semiHidden="1" w:unhideWhenUsed="1"/>
     <w:lsdException w:name="Table Elegant" w:semiHidden="1" w:unhideWhenUsed="1"/>
     <w:lsdException w:name="Table Professional" w:semiHidden="1" w:unhideWhenUsed="1"/>
-    <w:lsdException w:name="Table Subtle 1" w:semiHidden="1" w:unhideWhenUsed="1"/>
     <w:lsdException w:name="Table Subtle 2" w:semiHidden="1" w:unhideWhenUsed="1"/>
     <w:lsdException w:name="Table Web 1" w:semiHidden="1" w:unhideWhenUsed="1"/>
-    <w:lsdException w:name="Table Web 2" w:semiHidden="1" w:unhideWhenUsed="1"/>
-    <w:lsdException w:name="Table Web 3" w:semiHidden="1" w:unhideWhenUsed="1"/>
     <w:lsdException w:name="Balloon Text" w:semiHidden="1" w:unhideWhenUsed="1"/>
     <w:lsdException w:name="Table Grid" w:uiPriority="59"/>
     <w:lsdException w:name="Table Theme" w:semiHidden="1" w:unhideWhenUsed="1"/>
@@ -2172,6 +4523,11 @@
     <w:lsdException w:name="List Table 5 Dark Accent 6" w:uiPriority="50"/>
     <w:lsdException w:name="List Table 6 Colorful Accent 6" w:uiPriority="51"/>
     <w:lsdException w:name="List Table 7 Colorful Accent 6" w:uiPriority="52"/>
+    <w:lsdException w:name="Mention" w:semiHidden="1" w:unhideWhenUsed="1"/>
+    <w:lsdException w:name="Smart Hyperlink" w:semiHidden="1" w:unhideWhenUsed="1"/>
+    <w:lsdException w:name="Hashtag" w:semiHidden="1" w:unhideWhenUsed="1"/>
+    <w:lsdException w:name="Unresolved Mention" w:semiHidden="1" w:unhideWhenUsed="1"/>
+    <w:lsdException w:name="Smart Link" w:semiHidden="1" w:unhideWhenUsed="1"/>
   </w:latentStyles>
   <w:style w:type="paragraph" w:default="1" w:styleId="a">
     <w:name w:val="Normal"/>

</xml_diff>